<commit_message>
Add signal tooltips, logic audit, and S6 noise fix
Prototype (unigrow_poc_tenant_signals.html):
- Each signal title now has a hover tooltip (?) explaining the exact
  logic, thresholds, data sources, and date ranges used
- S5: Revenue at risk calculated from bestseller SKUs only (sales >= 5/month)
- S6: Added min 2 returns floor to filter noise from single-return combos

Doc (UniGrow_Signal_PoC_Brief.docx):
- New section: "Logic Gaps Identified During PoC" with 6-row table
  covering S1 projection bias, S1/S2 overlap, S5 time mismatch,
  S6 revenue weighting gap, S7 threshold aggressiveness
- Updated S5 description to reflect revenue impact mapping
- Updated S6 description to reflect returned >= 2 filter
- Added tooltip transparency as a PoC proof point

Co-Authored-By: Claude Opus 4.6 <noreply@anthropic.com>
</commit_message>
<xml_diff>
--- a/Desktop/Claude-Workspace/projects/UniGrow/UniGrow_Signal_PoC_Brief.docx
+++ b/Desktop/Claude-Workspace/projects/UniGrow/UniGrow_Signal_PoC_Brief.docx
@@ -1324,7 +1324,7 @@
                 <w:sz w:val="20"/>
                 <w:szCs w:val="20"/>
               </w:rPr>
-              <w:t xml:space="preserve">SKUs with dangerously low days-of-hand relative to 30-day sales velocity; tiered as STOCKOUT / CRITICAL / WARNING / WATCH</w:t>
+              <w:t xml:space="preserve">Bestseller SKUs (5+ sold/month) with low DOH. Tiered: STOCKOUT / CRITICAL / WARNING / WATCH. Impact shown as revenue at risk (daily velocity x avg price x 7-day window).</w:t>
             </w:r>
           </w:p>
         </w:tc>
@@ -1353,7 +1353,7 @@
                 <w:sz w:val="20"/>
                 <w:szCs w:val="20"/>
               </w:rPr>
-              <w:t xml:space="preserve">low_inventory_vs_last_30d_sales</w:t>
+              <w:t xml:space="preserve">low_inventory + transaction (90d price)</w:t>
             </w:r>
           </w:p>
         </w:tc>
@@ -1382,7 +1382,7 @@
                 <w:sz w:val="20"/>
                 <w:szCs w:val="20"/>
               </w:rPr>
-              <w:t xml:space="preserve">Last 30 days sales velocity</w:t>
+              <w:t xml:space="preserve">30d velocity, 90d avg price</w:t>
             </w:r>
           </w:p>
         </w:tc>
@@ -1509,7 +1509,7 @@
                 <w:sz w:val="20"/>
                 <w:szCs w:val="20"/>
               </w:rPr>
-              <w:t xml:space="preserve">SKU + channel combos with return rates (RTO + CIR) significantly above baseline; excludes D2C channels</w:t>
+              <w:t xml:space="preserve">SKU + channel combos with return rates (RTO + CIR) above 10%. Excludes D2C. Filters: min 5 dispatched, min 2 returned.</w:t>
             </w:r>
           </w:p>
         </w:tc>
@@ -5748,6 +5748,808 @@
         <w:rPr>
           <w:rFonts w:ascii="Arial" w:cs="Arial" w:eastAsia="Arial" w:hAnsi="Arial"/>
         </w:rPr>
+        <w:t xml:space="preserve">Logic Gaps Identified During PoC</w:t>
+      </w:r>
+    </w:p>
+    <w:p>
+      <w:pPr>
+        <w:spacing w:after="120" w:line="276"/>
+      </w:pPr>
+      <w:r>
+        <w:rPr>
+          <w:rFonts w:ascii="Arial" w:cs="Arial" w:eastAsia="Arial" w:hAnsi="Arial"/>
+          <w:sz w:val="22"/>
+          <w:szCs w:val="22"/>
+        </w:rPr>
+        <w:t xml:space="preserve">The following limitations were identified during the signal logic audit. These are not blockers for the PoC but must be addressed before production.</w:t>
+      </w:r>
+    </w:p>
+    <w:p>
+      <w:pPr>
+        <w:spacing w:after="60"/>
+      </w:pPr>
+    </w:p>
+    <w:tbl>
+      <w:tblPr>
+        <w:tblW w:type="dxa" w:w="9360"/>
+        <w:tblBorders>
+          <w:top w:val="single" w:color="auto" w:sz="4"/>
+          <w:left w:val="single" w:color="auto" w:sz="4"/>
+          <w:bottom w:val="single" w:color="auto" w:sz="4"/>
+          <w:right w:val="single" w:color="auto" w:sz="4"/>
+          <w:insideH w:val="single" w:color="auto" w:sz="4"/>
+          <w:insideV w:val="single" w:color="auto" w:sz="4"/>
+        </w:tblBorders>
+      </w:tblPr>
+      <w:tblGrid>
+        <w:gridCol w:w="1000"/>
+        <w:gridCol w:w="3400"/>
+        <w:gridCol w:w="3400"/>
+        <w:gridCol w:w="1560"/>
+      </w:tblGrid>
+      <w:tr>
+        <w:tc>
+          <w:tcPr>
+            <w:tcW w:type="dxa" w:w="1000"/>
+            <w:tcBorders>
+              <w:top w:val="single" w:color="CCCCCC" w:sz="1"/>
+              <w:left w:val="single" w:color="CCCCCC" w:sz="1"/>
+              <w:bottom w:val="single" w:color="CCCCCC" w:sz="1"/>
+              <w:right w:val="single" w:color="CCCCCC" w:sz="1"/>
+            </w:tcBorders>
+            <w:shd w:fill="1F87C2" w:val="clear"/>
+            <w:tcMar>
+              <w:top w:type="dxa" w:w="80"/>
+              <w:left w:type="dxa" w:w="120"/>
+              <w:bottom w:type="dxa" w:w="80"/>
+              <w:right w:type="dxa" w:w="120"/>
+            </w:tcMar>
+            <w:vAlign w:val="center"/>
+          </w:tcPr>
+          <w:p>
+            <w:r>
+              <w:rPr>
+                <w:rFonts w:ascii="Arial" w:cs="Arial" w:eastAsia="Arial" w:hAnsi="Arial"/>
+                <w:b/>
+                <w:bCs/>
+                <w:color w:val="FFFFFF"/>
+                <w:sz w:val="20"/>
+                <w:szCs w:val="20"/>
+              </w:rPr>
+              <w:t xml:space="preserve">Signal</w:t>
+            </w:r>
+          </w:p>
+        </w:tc>
+        <w:tc>
+          <w:tcPr>
+            <w:tcW w:type="dxa" w:w="3400"/>
+            <w:tcBorders>
+              <w:top w:val="single" w:color="CCCCCC" w:sz="1"/>
+              <w:left w:val="single" w:color="CCCCCC" w:sz="1"/>
+              <w:bottom w:val="single" w:color="CCCCCC" w:sz="1"/>
+              <w:right w:val="single" w:color="CCCCCC" w:sz="1"/>
+            </w:tcBorders>
+            <w:shd w:fill="1F87C2" w:val="clear"/>
+            <w:tcMar>
+              <w:top w:type="dxa" w:w="80"/>
+              <w:left w:type="dxa" w:w="120"/>
+              <w:bottom w:type="dxa" w:w="80"/>
+              <w:right w:type="dxa" w:w="120"/>
+            </w:tcMar>
+            <w:vAlign w:val="center"/>
+          </w:tcPr>
+          <w:p>
+            <w:r>
+              <w:rPr>
+                <w:rFonts w:ascii="Arial" w:cs="Arial" w:eastAsia="Arial" w:hAnsi="Arial"/>
+                <w:b/>
+                <w:bCs/>
+                <w:color w:val="FFFFFF"/>
+                <w:sz w:val="20"/>
+                <w:szCs w:val="20"/>
+              </w:rPr>
+              <w:t xml:space="preserve">Gap</w:t>
+            </w:r>
+          </w:p>
+        </w:tc>
+        <w:tc>
+          <w:tcPr>
+            <w:tcW w:type="dxa" w:w="3400"/>
+            <w:tcBorders>
+              <w:top w:val="single" w:color="CCCCCC" w:sz="1"/>
+              <w:left w:val="single" w:color="CCCCCC" w:sz="1"/>
+              <w:bottom w:val="single" w:color="CCCCCC" w:sz="1"/>
+              <w:right w:val="single" w:color="CCCCCC" w:sz="1"/>
+            </w:tcBorders>
+            <w:shd w:fill="1F87C2" w:val="clear"/>
+            <w:tcMar>
+              <w:top w:type="dxa" w:w="80"/>
+              <w:left w:type="dxa" w:w="120"/>
+              <w:bottom w:type="dxa" w:w="80"/>
+              <w:right w:type="dxa" w:w="120"/>
+            </w:tcMar>
+            <w:vAlign w:val="center"/>
+          </w:tcPr>
+          <w:p>
+            <w:r>
+              <w:rPr>
+                <w:rFonts w:ascii="Arial" w:cs="Arial" w:eastAsia="Arial" w:hAnsi="Arial"/>
+                <w:b/>
+                <w:bCs/>
+                <w:color w:val="FFFFFF"/>
+                <w:sz w:val="20"/>
+                <w:szCs w:val="20"/>
+              </w:rPr>
+              <w:t xml:space="preserve">Impact</w:t>
+            </w:r>
+          </w:p>
+        </w:tc>
+        <w:tc>
+          <w:tcPr>
+            <w:tcW w:type="dxa" w:w="1560"/>
+            <w:tcBorders>
+              <w:top w:val="single" w:color="CCCCCC" w:sz="1"/>
+              <w:left w:val="single" w:color="CCCCCC" w:sz="1"/>
+              <w:bottom w:val="single" w:color="CCCCCC" w:sz="1"/>
+              <w:right w:val="single" w:color="CCCCCC" w:sz="1"/>
+            </w:tcBorders>
+            <w:shd w:fill="1F87C2" w:val="clear"/>
+            <w:tcMar>
+              <w:top w:type="dxa" w:w="80"/>
+              <w:left w:type="dxa" w:w="120"/>
+              <w:bottom w:type="dxa" w:w="80"/>
+              <w:right w:type="dxa" w:w="120"/>
+            </w:tcMar>
+            <w:vAlign w:val="center"/>
+          </w:tcPr>
+          <w:p>
+            <w:r>
+              <w:rPr>
+                <w:rFonts w:ascii="Arial" w:cs="Arial" w:eastAsia="Arial" w:hAnsi="Arial"/>
+                <w:b/>
+                <w:bCs/>
+                <w:color w:val="FFFFFF"/>
+                <w:sz w:val="20"/>
+                <w:szCs w:val="20"/>
+              </w:rPr>
+              <w:t xml:space="preserve">Fix Effort</w:t>
+            </w:r>
+          </w:p>
+        </w:tc>
+      </w:tr>
+      <w:tr>
+        <w:tc>
+          <w:tcPr>
+            <w:tcW w:type="dxa" w:w="1000"/>
+            <w:tcBorders>
+              <w:top w:val="single" w:color="CCCCCC" w:sz="1"/>
+              <w:left w:val="single" w:color="CCCCCC" w:sz="1"/>
+              <w:bottom w:val="single" w:color="CCCCCC" w:sz="1"/>
+              <w:right w:val="single" w:color="CCCCCC" w:sz="1"/>
+            </w:tcBorders>
+            <w:tcMar>
+              <w:top w:type="dxa" w:w="80"/>
+              <w:left w:type="dxa" w:w="120"/>
+              <w:bottom w:type="dxa" w:w="80"/>
+              <w:right w:type="dxa" w:w="120"/>
+            </w:tcMar>
+            <w:vAlign w:val="center"/>
+          </w:tcPr>
+          <w:p>
+            <w:r>
+              <w:rPr>
+                <w:rFonts w:ascii="Arial" w:cs="Arial" w:eastAsia="Arial" w:hAnsi="Arial"/>
+                <w:b/>
+                <w:bCs/>
+                <w:color w:val="333333"/>
+                <w:sz w:val="20"/>
+                <w:szCs w:val="20"/>
+              </w:rPr>
+              <w:t xml:space="preserve">S1</w:t>
+            </w:r>
+          </w:p>
+        </w:tc>
+        <w:tc>
+          <w:tcPr>
+            <w:tcW w:type="dxa" w:w="3400"/>
+            <w:tcBorders>
+              <w:top w:val="single" w:color="CCCCCC" w:sz="1"/>
+              <w:left w:val="single" w:color="CCCCCC" w:sz="1"/>
+              <w:bottom w:val="single" w:color="CCCCCC" w:sz="1"/>
+              <w:right w:val="single" w:color="CCCCCC" w:sz="1"/>
+            </w:tcBorders>
+            <w:tcMar>
+              <w:top w:type="dxa" w:w="80"/>
+              <w:left w:type="dxa" w:w="120"/>
+              <w:bottom w:type="dxa" w:w="80"/>
+              <w:right w:type="dxa" w:w="120"/>
+            </w:tcMar>
+            <w:vAlign w:val="center"/>
+          </w:tcPr>
+          <w:p>
+            <w:r>
+              <w:rPr>
+                <w:rFonts w:ascii="Arial" w:cs="Arial" w:eastAsia="Arial" w:hAnsi="Arial"/>
+                <w:color w:val="333333"/>
+                <w:sz w:val="20"/>
+                <w:szCs w:val="20"/>
+              </w:rPr>
+              <w:t xml:space="preserve">Revenue projection assumes new SKUs earn the same rev/SKU as existing ones on that channel. Overestimates for niche channels.</w:t>
+            </w:r>
+          </w:p>
+        </w:tc>
+        <w:tc>
+          <w:tcPr>
+            <w:tcW w:type="dxa" w:w="3400"/>
+            <w:tcBorders>
+              <w:top w:val="single" w:color="CCCCCC" w:sz="1"/>
+              <w:left w:val="single" w:color="CCCCCC" w:sz="1"/>
+              <w:bottom w:val="single" w:color="CCCCCC" w:sz="1"/>
+              <w:right w:val="single" w:color="CCCCCC" w:sz="1"/>
+            </w:tcBorders>
+            <w:tcMar>
+              <w:top w:type="dxa" w:w="80"/>
+              <w:left w:type="dxa" w:w="120"/>
+              <w:bottom w:type="dxa" w:w="80"/>
+              <w:right w:type="dxa" w:w="120"/>
+            </w:tcMar>
+            <w:vAlign w:val="center"/>
+          </w:tcPr>
+          <w:p>
+            <w:r>
+              <w:rPr>
+                <w:rFonts w:ascii="Arial" w:cs="Arial" w:eastAsia="Arial" w:hAnsi="Arial"/>
+                <w:color w:val="333333"/>
+                <w:sz w:val="20"/>
+                <w:szCs w:val="20"/>
+              </w:rPr>
+              <w:t xml:space="preserve">Impact numbers may be inflated for small channels. Misleading prioritisation.</w:t>
+            </w:r>
+          </w:p>
+        </w:tc>
+        <w:tc>
+          <w:tcPr>
+            <w:tcW w:type="dxa" w:w="1560"/>
+            <w:tcBorders>
+              <w:top w:val="single" w:color="CCCCCC" w:sz="1"/>
+              <w:left w:val="single" w:color="CCCCCC" w:sz="1"/>
+              <w:bottom w:val="single" w:color="CCCCCC" w:sz="1"/>
+              <w:right w:val="single" w:color="CCCCCC" w:sz="1"/>
+            </w:tcBorders>
+            <w:tcMar>
+              <w:top w:type="dxa" w:w="80"/>
+              <w:left w:type="dxa" w:w="120"/>
+              <w:bottom w:type="dxa" w:w="80"/>
+              <w:right w:type="dxa" w:w="120"/>
+            </w:tcMar>
+            <w:vAlign w:val="center"/>
+          </w:tcPr>
+          <w:p>
+            <w:r>
+              <w:rPr>
+                <w:rFonts w:ascii="Arial" w:cs="Arial" w:eastAsia="Arial" w:hAnsi="Arial"/>
+                <w:b/>
+                <w:bCs/>
+                <w:color w:val="333333"/>
+                <w:sz w:val="20"/>
+                <w:szCs w:val="20"/>
+              </w:rPr>
+              <w:t xml:space="preserve">Medium</w:t>
+            </w:r>
+          </w:p>
+        </w:tc>
+      </w:tr>
+      <w:tr>
+        <w:tc>
+          <w:tcPr>
+            <w:tcW w:type="dxa" w:w="1000"/>
+            <w:tcBorders>
+              <w:top w:val="single" w:color="CCCCCC" w:sz="1"/>
+              <w:left w:val="single" w:color="CCCCCC" w:sz="1"/>
+              <w:bottom w:val="single" w:color="CCCCCC" w:sz="1"/>
+              <w:right w:val="single" w:color="CCCCCC" w:sz="1"/>
+            </w:tcBorders>
+            <w:shd w:fill="F5F9FC" w:val="clear"/>
+            <w:tcMar>
+              <w:top w:type="dxa" w:w="80"/>
+              <w:left w:type="dxa" w:w="120"/>
+              <w:bottom w:type="dxa" w:w="80"/>
+              <w:right w:type="dxa" w:w="120"/>
+            </w:tcMar>
+            <w:vAlign w:val="center"/>
+          </w:tcPr>
+          <w:p>
+            <w:r>
+              <w:rPr>
+                <w:rFonts w:ascii="Arial" w:cs="Arial" w:eastAsia="Arial" w:hAnsi="Arial"/>
+                <w:b/>
+                <w:bCs/>
+                <w:color w:val="333333"/>
+                <w:sz w:val="20"/>
+                <w:szCs w:val="20"/>
+              </w:rPr>
+              <w:t xml:space="preserve">S1/S2</w:t>
+            </w:r>
+          </w:p>
+        </w:tc>
+        <w:tc>
+          <w:tcPr>
+            <w:tcW w:type="dxa" w:w="3400"/>
+            <w:tcBorders>
+              <w:top w:val="single" w:color="CCCCCC" w:sz="1"/>
+              <w:left w:val="single" w:color="CCCCCC" w:sz="1"/>
+              <w:bottom w:val="single" w:color="CCCCCC" w:sz="1"/>
+              <w:right w:val="single" w:color="CCCCCC" w:sz="1"/>
+            </w:tcBorders>
+            <w:shd w:fill="F5F9FC" w:val="clear"/>
+            <w:tcMar>
+              <w:top w:type="dxa" w:w="80"/>
+              <w:left w:type="dxa" w:w="120"/>
+              <w:bottom w:type="dxa" w:w="80"/>
+              <w:right w:type="dxa" w:w="120"/>
+            </w:tcMar>
+            <w:vAlign w:val="center"/>
+          </w:tcPr>
+          <w:p>
+            <w:r>
+              <w:rPr>
+                <w:rFonts w:ascii="Arial" w:cs="Arial" w:eastAsia="Arial" w:hAnsi="Arial"/>
+                <w:color w:val="333333"/>
+                <w:sz w:val="20"/>
+                <w:szCs w:val="20"/>
+              </w:rPr>
+              <w:t xml:space="preserve">Overlap: a channel can appear in both Listing Gap and Channel Expansion. The 50% coverage threshold is hardcoded with no segment adjustment.</w:t>
+            </w:r>
+          </w:p>
+        </w:tc>
+        <w:tc>
+          <w:tcPr>
+            <w:tcW w:type="dxa" w:w="3400"/>
+            <w:tcBorders>
+              <w:top w:val="single" w:color="CCCCCC" w:sz="1"/>
+              <w:left w:val="single" w:color="CCCCCC" w:sz="1"/>
+              <w:bottom w:val="single" w:color="CCCCCC" w:sz="1"/>
+              <w:right w:val="single" w:color="CCCCCC" w:sz="1"/>
+            </w:tcBorders>
+            <w:shd w:fill="F5F9FC" w:val="clear"/>
+            <w:tcMar>
+              <w:top w:type="dxa" w:w="80"/>
+              <w:left w:type="dxa" w:w="120"/>
+              <w:bottom w:type="dxa" w:w="80"/>
+              <w:right w:type="dxa" w:w="120"/>
+            </w:tcMar>
+            <w:vAlign w:val="center"/>
+          </w:tcPr>
+          <w:p>
+            <w:r>
+              <w:rPr>
+                <w:rFonts w:ascii="Arial" w:cs="Arial" w:eastAsia="Arial" w:hAnsi="Arial"/>
+                <w:color w:val="333333"/>
+                <w:sz w:val="20"/>
+                <w:szCs w:val="20"/>
+              </w:rPr>
+              <w:t xml:space="preserve">Sellers may see two signals pointing at the same problem. Threshold may be too aggressive for fashion (many SKUs) and too lenient for supplements (few SKUs).</w:t>
+            </w:r>
+          </w:p>
+        </w:tc>
+        <w:tc>
+          <w:tcPr>
+            <w:tcW w:type="dxa" w:w="1560"/>
+            <w:tcBorders>
+              <w:top w:val="single" w:color="CCCCCC" w:sz="1"/>
+              <w:left w:val="single" w:color="CCCCCC" w:sz="1"/>
+              <w:bottom w:val="single" w:color="CCCCCC" w:sz="1"/>
+              <w:right w:val="single" w:color="CCCCCC" w:sz="1"/>
+            </w:tcBorders>
+            <w:shd w:fill="F5F9FC" w:val="clear"/>
+            <w:tcMar>
+              <w:top w:type="dxa" w:w="80"/>
+              <w:left w:type="dxa" w:w="120"/>
+              <w:bottom w:type="dxa" w:w="80"/>
+              <w:right w:type="dxa" w:w="120"/>
+            </w:tcMar>
+            <w:vAlign w:val="center"/>
+          </w:tcPr>
+          <w:p>
+            <w:r>
+              <w:rPr>
+                <w:rFonts w:ascii="Arial" w:cs="Arial" w:eastAsia="Arial" w:hAnsi="Arial"/>
+                <w:b/>
+                <w:bCs/>
+                <w:color w:val="333333"/>
+                <w:sz w:val="20"/>
+                <w:szCs w:val="20"/>
+              </w:rPr>
+              <w:t xml:space="preserve">Low</w:t>
+            </w:r>
+          </w:p>
+        </w:tc>
+      </w:tr>
+      <w:tr>
+        <w:tc>
+          <w:tcPr>
+            <w:tcW w:type="dxa" w:w="1000"/>
+            <w:tcBorders>
+              <w:top w:val="single" w:color="CCCCCC" w:sz="1"/>
+              <w:left w:val="single" w:color="CCCCCC" w:sz="1"/>
+              <w:bottom w:val="single" w:color="CCCCCC" w:sz="1"/>
+              <w:right w:val="single" w:color="CCCCCC" w:sz="1"/>
+            </w:tcBorders>
+            <w:tcMar>
+              <w:top w:type="dxa" w:w="80"/>
+              <w:left w:type="dxa" w:w="120"/>
+              <w:bottom w:type="dxa" w:w="80"/>
+              <w:right w:type="dxa" w:w="120"/>
+            </w:tcMar>
+            <w:vAlign w:val="center"/>
+          </w:tcPr>
+          <w:p>
+            <w:r>
+              <w:rPr>
+                <w:rFonts w:ascii="Arial" w:cs="Arial" w:eastAsia="Arial" w:hAnsi="Arial"/>
+                <w:b/>
+                <w:bCs/>
+                <w:color w:val="333333"/>
+                <w:sz w:val="20"/>
+                <w:szCs w:val="20"/>
+              </w:rPr>
+              <w:t xml:space="preserve">S5</w:t>
+            </w:r>
+          </w:p>
+        </w:tc>
+        <w:tc>
+          <w:tcPr>
+            <w:tcW w:type="dxa" w:w="3400"/>
+            <w:tcBorders>
+              <w:top w:val="single" w:color="CCCCCC" w:sz="1"/>
+              <w:left w:val="single" w:color="CCCCCC" w:sz="1"/>
+              <w:bottom w:val="single" w:color="CCCCCC" w:sz="1"/>
+              <w:right w:val="single" w:color="CCCCCC" w:sz="1"/>
+            </w:tcBorders>
+            <w:tcMar>
+              <w:top w:type="dxa" w:w="80"/>
+              <w:left w:type="dxa" w:w="120"/>
+              <w:bottom w:type="dxa" w:w="80"/>
+              <w:right w:type="dxa" w:w="120"/>
+            </w:tcMar>
+            <w:vAlign w:val="center"/>
+          </w:tcPr>
+          <w:p>
+            <w:r>
+              <w:rPr>
+                <w:rFonts w:ascii="Arial" w:cs="Arial" w:eastAsia="Arial" w:hAnsi="Arial"/>
+                <w:color w:val="333333"/>
+                <w:sz w:val="20"/>
+                <w:szCs w:val="20"/>
+              </w:rPr>
+              <w:t xml:space="preserve">Revenue uses 90-day avg selling price but DOH uses 30-day sales velocity. Bestseller threshold (5 units/month) is absolute, not relative to AOV.</w:t>
+            </w:r>
+          </w:p>
+        </w:tc>
+        <w:tc>
+          <w:tcPr>
+            <w:tcW w:type="dxa" w:w="3400"/>
+            <w:tcBorders>
+              <w:top w:val="single" w:color="CCCCCC" w:sz="1"/>
+              <w:left w:val="single" w:color="CCCCCC" w:sz="1"/>
+              <w:bottom w:val="single" w:color="CCCCCC" w:sz="1"/>
+              <w:right w:val="single" w:color="CCCCCC" w:sz="1"/>
+            </w:tcBorders>
+            <w:tcMar>
+              <w:top w:type="dxa" w:w="80"/>
+              <w:left w:type="dxa" w:w="120"/>
+              <w:bottom w:type="dxa" w:w="80"/>
+              <w:right w:type="dxa" w:w="120"/>
+            </w:tcMar>
+            <w:vAlign w:val="center"/>
+          </w:tcPr>
+          <w:p>
+            <w:r>
+              <w:rPr>
+                <w:rFonts w:ascii="Arial" w:cs="Arial" w:eastAsia="Arial" w:hAnsi="Arial"/>
+                <w:color w:val="333333"/>
+                <w:sz w:val="20"/>
+                <w:szCs w:val="20"/>
+              </w:rPr>
+              <w:t xml:space="preserve">Seasonal SKUs may show inflated or deflated revenue. A high-AOV SKU selling 3/month still matters.</w:t>
+            </w:r>
+          </w:p>
+        </w:tc>
+        <w:tc>
+          <w:tcPr>
+            <w:tcW w:type="dxa" w:w="1560"/>
+            <w:tcBorders>
+              <w:top w:val="single" w:color="CCCCCC" w:sz="1"/>
+              <w:left w:val="single" w:color="CCCCCC" w:sz="1"/>
+              <w:bottom w:val="single" w:color="CCCCCC" w:sz="1"/>
+              <w:right w:val="single" w:color="CCCCCC" w:sz="1"/>
+            </w:tcBorders>
+            <w:tcMar>
+              <w:top w:type="dxa" w:w="80"/>
+              <w:left w:type="dxa" w:w="120"/>
+              <w:bottom w:type="dxa" w:w="80"/>
+              <w:right w:type="dxa" w:w="120"/>
+            </w:tcMar>
+            <w:vAlign w:val="center"/>
+          </w:tcPr>
+          <w:p>
+            <w:r>
+              <w:rPr>
+                <w:rFonts w:ascii="Arial" w:cs="Arial" w:eastAsia="Arial" w:hAnsi="Arial"/>
+                <w:b/>
+                <w:bCs/>
+                <w:color w:val="333333"/>
+                <w:sz w:val="20"/>
+                <w:szCs w:val="20"/>
+              </w:rPr>
+              <w:t xml:space="preserve">Medium</w:t>
+            </w:r>
+          </w:p>
+        </w:tc>
+      </w:tr>
+      <w:tr>
+        <w:tc>
+          <w:tcPr>
+            <w:tcW w:type="dxa" w:w="1000"/>
+            <w:tcBorders>
+              <w:top w:val="single" w:color="CCCCCC" w:sz="1"/>
+              <w:left w:val="single" w:color="CCCCCC" w:sz="1"/>
+              <w:bottom w:val="single" w:color="CCCCCC" w:sz="1"/>
+              <w:right w:val="single" w:color="CCCCCC" w:sz="1"/>
+            </w:tcBorders>
+            <w:shd w:fill="F5F9FC" w:val="clear"/>
+            <w:tcMar>
+              <w:top w:type="dxa" w:w="80"/>
+              <w:left w:type="dxa" w:w="120"/>
+              <w:bottom w:type="dxa" w:w="80"/>
+              <w:right w:type="dxa" w:w="120"/>
+            </w:tcMar>
+            <w:vAlign w:val="center"/>
+          </w:tcPr>
+          <w:p>
+            <w:r>
+              <w:rPr>
+                <w:rFonts w:ascii="Arial" w:cs="Arial" w:eastAsia="Arial" w:hAnsi="Arial"/>
+                <w:b/>
+                <w:bCs/>
+                <w:color w:val="333333"/>
+                <w:sz w:val="20"/>
+                <w:szCs w:val="20"/>
+              </w:rPr>
+              <w:t xml:space="preserve">S6</w:t>
+            </w:r>
+          </w:p>
+        </w:tc>
+        <w:tc>
+          <w:tcPr>
+            <w:tcW w:type="dxa" w:w="3400"/>
+            <w:tcBorders>
+              <w:top w:val="single" w:color="CCCCCC" w:sz="1"/>
+              <w:left w:val="single" w:color="CCCCCC" w:sz="1"/>
+              <w:bottom w:val="single" w:color="CCCCCC" w:sz="1"/>
+              <w:right w:val="single" w:color="CCCCCC" w:sz="1"/>
+            </w:tcBorders>
+            <w:shd w:fill="F5F9FC" w:val="clear"/>
+            <w:tcMar>
+              <w:top w:type="dxa" w:w="80"/>
+              <w:left w:type="dxa" w:w="120"/>
+              <w:bottom w:type="dxa" w:w="80"/>
+              <w:right w:type="dxa" w:w="120"/>
+            </w:tcMar>
+            <w:vAlign w:val="center"/>
+          </w:tcPr>
+          <w:p>
+            <w:r>
+              <w:rPr>
+                <w:rFonts w:ascii="Arial" w:cs="Arial" w:eastAsia="Arial" w:hAnsi="Arial"/>
+                <w:color w:val="333333"/>
+                <w:sz w:val="20"/>
+                <w:szCs w:val="20"/>
+              </w:rPr>
+              <w:t xml:space="preserve">Fixed in PoC: added min 2 returns floor to filter noise. Remaining gap: no revenue weighting. A ₹100 SKU with 20% returns gets same priority as a ₹5000 SKU.</w:t>
+            </w:r>
+          </w:p>
+        </w:tc>
+        <w:tc>
+          <w:tcPr>
+            <w:tcW w:type="dxa" w:w="3400"/>
+            <w:tcBorders>
+              <w:top w:val="single" w:color="CCCCCC" w:sz="1"/>
+              <w:left w:val="single" w:color="CCCCCC" w:sz="1"/>
+              <w:bottom w:val="single" w:color="CCCCCC" w:sz="1"/>
+              <w:right w:val="single" w:color="CCCCCC" w:sz="1"/>
+            </w:tcBorders>
+            <w:shd w:fill="F5F9FC" w:val="clear"/>
+            <w:tcMar>
+              <w:top w:type="dxa" w:w="80"/>
+              <w:left w:type="dxa" w:w="120"/>
+              <w:bottom w:type="dxa" w:w="80"/>
+              <w:right w:type="dxa" w:w="120"/>
+            </w:tcMar>
+            <w:vAlign w:val="center"/>
+          </w:tcPr>
+          <w:p>
+            <w:r>
+              <w:rPr>
+                <w:rFonts w:ascii="Arial" w:cs="Arial" w:eastAsia="Arial" w:hAnsi="Arial"/>
+                <w:color w:val="333333"/>
+                <w:sz w:val="20"/>
+                <w:szCs w:val="20"/>
+              </w:rPr>
+              <w:t xml:space="preserve">Low-value noisy SKUs may dominate the signal. High-value return problems may be buried.</w:t>
+            </w:r>
+          </w:p>
+        </w:tc>
+        <w:tc>
+          <w:tcPr>
+            <w:tcW w:type="dxa" w:w="1560"/>
+            <w:tcBorders>
+              <w:top w:val="single" w:color="CCCCCC" w:sz="1"/>
+              <w:left w:val="single" w:color="CCCCCC" w:sz="1"/>
+              <w:bottom w:val="single" w:color="CCCCCC" w:sz="1"/>
+              <w:right w:val="single" w:color="CCCCCC" w:sz="1"/>
+            </w:tcBorders>
+            <w:shd w:fill="F5F9FC" w:val="clear"/>
+            <w:tcMar>
+              <w:top w:type="dxa" w:w="80"/>
+              <w:left w:type="dxa" w:w="120"/>
+              <w:bottom w:type="dxa" w:w="80"/>
+              <w:right w:type="dxa" w:w="120"/>
+            </w:tcMar>
+            <w:vAlign w:val="center"/>
+          </w:tcPr>
+          <w:p>
+            <w:r>
+              <w:rPr>
+                <w:rFonts w:ascii="Arial" w:cs="Arial" w:eastAsia="Arial" w:hAnsi="Arial"/>
+                <w:b/>
+                <w:bCs/>
+                <w:color w:val="333333"/>
+                <w:sz w:val="20"/>
+                <w:szCs w:val="20"/>
+              </w:rPr>
+              <w:t xml:space="preserve">Medium</w:t>
+            </w:r>
+          </w:p>
+        </w:tc>
+      </w:tr>
+      <w:tr>
+        <w:tc>
+          <w:tcPr>
+            <w:tcW w:type="dxa" w:w="1000"/>
+            <w:tcBorders>
+              <w:top w:val="single" w:color="CCCCCC" w:sz="1"/>
+              <w:left w:val="single" w:color="CCCCCC" w:sz="1"/>
+              <w:bottom w:val="single" w:color="CCCCCC" w:sz="1"/>
+              <w:right w:val="single" w:color="CCCCCC" w:sz="1"/>
+            </w:tcBorders>
+            <w:tcMar>
+              <w:top w:type="dxa" w:w="80"/>
+              <w:left w:type="dxa" w:w="120"/>
+              <w:bottom w:type="dxa" w:w="80"/>
+              <w:right w:type="dxa" w:w="120"/>
+            </w:tcMar>
+            <w:vAlign w:val="center"/>
+          </w:tcPr>
+          <w:p>
+            <w:r>
+              <w:rPr>
+                <w:rFonts w:ascii="Arial" w:cs="Arial" w:eastAsia="Arial" w:hAnsi="Arial"/>
+                <w:b/>
+                <w:bCs/>
+                <w:color w:val="333333"/>
+                <w:sz w:val="20"/>
+                <w:szCs w:val="20"/>
+              </w:rPr>
+              <w:t xml:space="preserve">S7</w:t>
+            </w:r>
+          </w:p>
+        </w:tc>
+        <w:tc>
+          <w:tcPr>
+            <w:tcW w:type="dxa" w:w="3400"/>
+            <w:tcBorders>
+              <w:top w:val="single" w:color="CCCCCC" w:sz="1"/>
+              <w:left w:val="single" w:color="CCCCCC" w:sz="1"/>
+              <w:bottom w:val="single" w:color="CCCCCC" w:sz="1"/>
+              <w:right w:val="single" w:color="CCCCCC" w:sz="1"/>
+            </w:tcBorders>
+            <w:tcMar>
+              <w:top w:type="dxa" w:w="80"/>
+              <w:left w:type="dxa" w:w="120"/>
+              <w:bottom w:type="dxa" w:w="80"/>
+              <w:right w:type="dxa" w:w="120"/>
+            </w:tcMar>
+            <w:vAlign w:val="center"/>
+          </w:tcPr>
+          <w:p>
+            <w:r>
+              <w:rPr>
+                <w:rFonts w:ascii="Arial" w:cs="Arial" w:eastAsia="Arial" w:hAnsi="Arial"/>
+                <w:color w:val="333333"/>
+                <w:sz w:val="20"/>
+                <w:szCs w:val="20"/>
+              </w:rPr>
+              <w:t xml:space="preserve">30% state concentration threshold ignores natural demand distribution. Maharashtra alone is 15–20% of India’s ecommerce. Only 2/15 tenants trigger this signal.</w:t>
+            </w:r>
+          </w:p>
+        </w:tc>
+        <w:tc>
+          <w:tcPr>
+            <w:tcW w:type="dxa" w:w="3400"/>
+            <w:tcBorders>
+              <w:top w:val="single" w:color="CCCCCC" w:sz="1"/>
+              <w:left w:val="single" w:color="CCCCCC" w:sz="1"/>
+              <w:bottom w:val="single" w:color="CCCCCC" w:sz="1"/>
+              <w:right w:val="single" w:color="CCCCCC" w:sz="1"/>
+            </w:tcBorders>
+            <w:tcMar>
+              <w:top w:type="dxa" w:w="80"/>
+              <w:left w:type="dxa" w:w="120"/>
+              <w:bottom w:type="dxa" w:w="80"/>
+              <w:right w:type="dxa" w:w="120"/>
+            </w:tcMar>
+            <w:vAlign w:val="center"/>
+          </w:tcPr>
+          <w:p>
+            <w:r>
+              <w:rPr>
+                <w:rFonts w:ascii="Arial" w:cs="Arial" w:eastAsia="Arial" w:hAnsi="Arial"/>
+                <w:color w:val="333333"/>
+                <w:sz w:val="20"/>
+                <w:szCs w:val="20"/>
+              </w:rPr>
+              <w:t xml:space="preserve">Signal fires too rarely. When it fires for MH-heavy SKUs, it may be a false positive (normal demand pattern, not concentration risk).</w:t>
+            </w:r>
+          </w:p>
+        </w:tc>
+        <w:tc>
+          <w:tcPr>
+            <w:tcW w:type="dxa" w:w="1560"/>
+            <w:tcBorders>
+              <w:top w:val="single" w:color="CCCCCC" w:sz="1"/>
+              <w:left w:val="single" w:color="CCCCCC" w:sz="1"/>
+              <w:bottom w:val="single" w:color="CCCCCC" w:sz="1"/>
+              <w:right w:val="single" w:color="CCCCCC" w:sz="1"/>
+            </w:tcBorders>
+            <w:tcMar>
+              <w:top w:type="dxa" w:w="80"/>
+              <w:left w:type="dxa" w:w="120"/>
+              <w:bottom w:type="dxa" w:w="80"/>
+              <w:right w:type="dxa" w:w="120"/>
+            </w:tcMar>
+            <w:vAlign w:val="center"/>
+          </w:tcPr>
+          <w:p>
+            <w:r>
+              <w:rPr>
+                <w:rFonts w:ascii="Arial" w:cs="Arial" w:eastAsia="Arial" w:hAnsi="Arial"/>
+                <w:b/>
+                <w:bCs/>
+                <w:color w:val="333333"/>
+                <w:sz w:val="20"/>
+                <w:szCs w:val="20"/>
+              </w:rPr>
+              <w:t xml:space="preserve">Low</w:t>
+            </w:r>
+          </w:p>
+        </w:tc>
+      </w:tr>
+    </w:tbl>
+    <w:p>
+      <w:pPr>
+        <w:spacing w:after="120"/>
+      </w:pPr>
+    </w:p>
+    <w:p>
+      <w:pPr>
+        <w:pStyle w:val="Heading1"/>
+        <w:spacing w:after="120" w:before="240"/>
+      </w:pPr>
+      <w:r>
+        <w:rPr>
+          <w:rFonts w:ascii="Arial" w:cs="Arial" w:eastAsia="Arial" w:hAnsi="Arial"/>
+        </w:rPr>
         <w:t xml:space="preserve">What This PoC Proves</w:t>
       </w:r>
     </w:p>
@@ -5821,6 +6623,24 @@
           <w:szCs w:val="22"/>
         </w:rPr>
         <w:t xml:space="preserve">Signal sparsity is real but manageable. Even the weakest tenant gets 2 signals. Most get 4.</w:t>
+      </w:r>
+    </w:p>
+    <w:p>
+      <w:pPr>
+        <w:pStyle w:val="ListParagraph"/>
+        <w:numPr>
+          <w:ilvl w:val="0"/>
+          <w:numId w:val="2"/>
+        </w:numPr>
+        <w:spacing w:after="60" w:line="276"/>
+      </w:pPr>
+      <w:r>
+        <w:rPr>
+          <w:rFonts w:ascii="Arial" w:cs="Arial" w:eastAsia="Arial" w:hAnsi="Arial"/>
+          <w:sz w:val="22"/>
+          <w:szCs w:val="22"/>
+        </w:rPr>
+        <w:t xml:space="preserve">Each signal includes a tooltip explaining the exact logic, thresholds, and data sources used. This transparency builds trust with sellers and internal stakeholders.</w:t>
       </w:r>
     </w:p>
     <w:p>

</xml_diff>

<commit_message>
Merge S1+S2 into Listing Coverage, top 20% bestseller, add AOV to KPI strip
- Merged Listing Gap (S1) and Channel Expansion (S2) into single Listing Coverage Gap signal
- Changed bestseller definition from absolute (5+ units/month) to relative (top 20% by sales volume per tenant)
- Added AOV tile to KPI strip (5 tiles: Gross Sales, Orders, AOV, Active SKUs, Active Channels)
- Set Showoff as default tenant on page load
- Removed tenant code suffix from dropdown
- Updated stakeholder brief docx with merged signal, new definitions, and revised coverage table

Co-Authored-By: Claude Opus 4.6 <noreply@anthropic.com>
</commit_message>
<xml_diff>
--- a/Desktop/Claude-Workspace/projects/UniGrow/UniGrow_Signal_PoC_Brief.docx
+++ b/Desktop/Claude-Workspace/projects/UniGrow/UniGrow_Signal_PoC_Brief.docx
@@ -274,7 +274,7 @@
           <w:sz w:val="22"/>
           <w:szCs w:val="22"/>
         </w:rPr>
-        <w:t xml:space="preserve">We evaluated 7 candidate signals (S1–S7). Two were dropped during schema discovery because the DWH lacks the required fields. Five made it into the working prototype.</w:t>
+        <w:t xml:space="preserve">We evaluated 7 candidate signals (S1–S7). Two were dropped during schema discovery because the DWH lacks the required fields. S1 (Listing Gap) and S2 (Channel Expansion) were merged into a single “Listing Coverage Gap” signal because they targeted the same underlying problem. Four signals made it into the working prototype.</w:t>
       </w:r>
     </w:p>
     <w:p>
@@ -524,7 +524,7 @@
                 <w:sz w:val="20"/>
                 <w:szCs w:val="20"/>
               </w:rPr>
-              <w:t xml:space="preserve">S1</w:t>
+              <w:t xml:space="preserve">S1/S2</w:t>
             </w:r>
           </w:p>
         </w:tc>
@@ -555,7 +555,7 @@
                 <w:sz w:val="20"/>
                 <w:szCs w:val="20"/>
               </w:rPr>
-              <w:t xml:space="preserve">Active Listing Gap</w:t>
+              <w:t xml:space="preserve">Listing Coverage Gap</w:t>
             </w:r>
           </w:p>
         </w:tc>
@@ -584,7 +584,7 @@
                 <w:sz w:val="20"/>
                 <w:szCs w:val="20"/>
               </w:rPr>
-              <w:t xml:space="preserve">SKUs in warehouse inventory but not listed on a channel where the tenant is active</w:t>
+              <w:t xml:space="preserve">Merged signal: channels with &lt;50% SKU coverage vs top channel. Revenue-generating channels sorted first by upside, then zero-revenue channels by gap size.</w:t>
             </w:r>
           </w:p>
         </w:tc>
@@ -613,7 +613,7 @@
                 <w:sz w:val="20"/>
                 <w:szCs w:val="20"/>
               </w:rPr>
-              <w:t xml:space="preserve">channel_listing + inventory</w:t>
+              <w:t xml:space="preserve">channel_listing + inventory + transaction</w:t>
             </w:r>
           </w:p>
         </w:tc>
@@ -642,7 +642,7 @@
                 <w:sz w:val="20"/>
                 <w:szCs w:val="20"/>
               </w:rPr>
-              <w:t xml:space="preserve">Current snapshot (no lookback)</w:t>
+              <w:t xml:space="preserve">Current snapshot + 30d revenue</w:t>
             </w:r>
           </w:p>
         </w:tc>
@@ -688,26 +688,25 @@
               <w:bottom w:val="single" w:color="CCCCCC" w:sz="1"/>
               <w:right w:val="single" w:color="CCCCCC" w:sz="1"/>
             </w:tcBorders>
-            <w:shd w:fill="F5F9FC" w:val="clear"/>
-            <w:tcMar>
-              <w:top w:type="dxa" w:w="80"/>
-              <w:left w:type="dxa" w:w="120"/>
-              <w:bottom w:type="dxa" w:w="80"/>
-              <w:right w:type="dxa" w:w="120"/>
-            </w:tcMar>
-            <w:vAlign w:val="center"/>
-          </w:tcPr>
-          <w:p>
-            <w:r>
-              <w:rPr>
-                <w:rFonts w:ascii="Arial" w:cs="Arial" w:eastAsia="Arial" w:hAnsi="Arial"/>
-                <w:b/>
-                <w:bCs/>
-                <w:color w:val="333333"/>
-                <w:sz w:val="20"/>
-                <w:szCs w:val="20"/>
-              </w:rPr>
-              <w:t xml:space="preserve">S2</w:t>
+            <w:tcMar>
+              <w:top w:type="dxa" w:w="80"/>
+              <w:left w:type="dxa" w:w="120"/>
+              <w:bottom w:type="dxa" w:w="80"/>
+              <w:right w:type="dxa" w:w="120"/>
+            </w:tcMar>
+            <w:vAlign w:val="center"/>
+          </w:tcPr>
+          <w:p>
+            <w:r>
+              <w:rPr>
+                <w:rFonts w:ascii="Arial" w:cs="Arial" w:eastAsia="Arial" w:hAnsi="Arial"/>
+                <w:b/>
+                <w:bCs/>
+                <w:color w:val="333333"/>
+                <w:sz w:val="20"/>
+                <w:szCs w:val="20"/>
+              </w:rPr>
+              <w:t xml:space="preserve">S3</w:t>
             </w:r>
           </w:p>
         </w:tc>
@@ -720,26 +719,25 @@
               <w:bottom w:val="single" w:color="CCCCCC" w:sz="1"/>
               <w:right w:val="single" w:color="CCCCCC" w:sz="1"/>
             </w:tcBorders>
-            <w:shd w:fill="F5F9FC" w:val="clear"/>
-            <w:tcMar>
-              <w:top w:type="dxa" w:w="80"/>
-              <w:left w:type="dxa" w:w="120"/>
-              <w:bottom w:type="dxa" w:w="80"/>
-              <w:right w:type="dxa" w:w="120"/>
-            </w:tcMar>
-            <w:vAlign w:val="center"/>
-          </w:tcPr>
-          <w:p>
-            <w:r>
-              <w:rPr>
-                <w:rFonts w:ascii="Arial" w:cs="Arial" w:eastAsia="Arial" w:hAnsi="Arial"/>
-                <w:b/>
-                <w:bCs/>
-                <w:color w:val="333333"/>
-                <w:sz w:val="20"/>
-                <w:szCs w:val="20"/>
-              </w:rPr>
-              <w:t xml:space="preserve">Channel Expansion</w:t>
+            <w:tcMar>
+              <w:top w:type="dxa" w:w="80"/>
+              <w:left w:type="dxa" w:w="120"/>
+              <w:bottom w:type="dxa" w:w="80"/>
+              <w:right w:type="dxa" w:w="120"/>
+            </w:tcMar>
+            <w:vAlign w:val="center"/>
+          </w:tcPr>
+          <w:p>
+            <w:r>
+              <w:rPr>
+                <w:rFonts w:ascii="Arial" w:cs="Arial" w:eastAsia="Arial" w:hAnsi="Arial"/>
+                <w:b/>
+                <w:bCs/>
+                <w:color w:val="333333"/>
+                <w:sz w:val="20"/>
+                <w:szCs w:val="20"/>
+              </w:rPr>
+              <w:t xml:space="preserve">New SKU Not Listed</w:t>
             </w:r>
           </w:p>
         </w:tc>
@@ -752,24 +750,23 @@
               <w:bottom w:val="single" w:color="CCCCCC" w:sz="1"/>
               <w:right w:val="single" w:color="CCCCCC" w:sz="1"/>
             </w:tcBorders>
-            <w:shd w:fill="F5F9FC" w:val="clear"/>
-            <w:tcMar>
-              <w:top w:type="dxa" w:w="80"/>
-              <w:left w:type="dxa" w:w="120"/>
-              <w:bottom w:type="dxa" w:w="80"/>
-              <w:right w:type="dxa" w:w="120"/>
-            </w:tcMar>
-            <w:vAlign w:val="center"/>
-          </w:tcPr>
-          <w:p>
-            <w:r>
-              <w:rPr>
-                <w:rFonts w:ascii="Arial" w:cs="Arial" w:eastAsia="Arial" w:hAnsi="Arial"/>
-                <w:color w:val="333333"/>
-                <w:sz w:val="20"/>
-                <w:szCs w:val="20"/>
-              </w:rPr>
-              <w:t xml:space="preserve">Channels where the tenant has low SKU coverage vs. their total catalog</w:t>
+            <w:tcMar>
+              <w:top w:type="dxa" w:w="80"/>
+              <w:left w:type="dxa" w:w="120"/>
+              <w:bottom w:type="dxa" w:w="80"/>
+              <w:right w:type="dxa" w:w="120"/>
+            </w:tcMar>
+            <w:vAlign w:val="center"/>
+          </w:tcPr>
+          <w:p>
+            <w:r>
+              <w:rPr>
+                <w:rFonts w:ascii="Arial" w:cs="Arial" w:eastAsia="Arial" w:hAnsi="Arial"/>
+                <w:color w:val="333333"/>
+                <w:sz w:val="20"/>
+                <w:szCs w:val="20"/>
+              </w:rPr>
+              <w:t xml:space="preserve">Recently added SKUs not yet listed on any channel</w:t>
             </w:r>
           </w:p>
         </w:tc>
@@ -782,24 +779,23 @@
               <w:bottom w:val="single" w:color="CCCCCC" w:sz="1"/>
               <w:right w:val="single" w:color="CCCCCC" w:sz="1"/>
             </w:tcBorders>
-            <w:shd w:fill="F5F9FC" w:val="clear"/>
-            <w:tcMar>
-              <w:top w:type="dxa" w:w="80"/>
-              <w:left w:type="dxa" w:w="120"/>
-              <w:bottom w:type="dxa" w:w="80"/>
-              <w:right w:type="dxa" w:w="120"/>
-            </w:tcMar>
-            <w:vAlign w:val="center"/>
-          </w:tcPr>
-          <w:p>
-            <w:r>
-              <w:rPr>
-                <w:rFonts w:ascii="Arial" w:cs="Arial" w:eastAsia="Arial" w:hAnsi="Arial"/>
-                <w:color w:val="333333"/>
-                <w:sz w:val="20"/>
-                <w:szCs w:val="20"/>
-              </w:rPr>
-              <w:t xml:space="preserve">channel_listing counts</w:t>
+            <w:tcMar>
+              <w:top w:type="dxa" w:w="80"/>
+              <w:left w:type="dxa" w:w="120"/>
+              <w:bottom w:type="dxa" w:w="80"/>
+              <w:right w:type="dxa" w:w="120"/>
+            </w:tcMar>
+            <w:vAlign w:val="center"/>
+          </w:tcPr>
+          <w:p>
+            <w:r>
+              <w:rPr>
+                <w:rFonts w:ascii="Arial" w:cs="Arial" w:eastAsia="Arial" w:hAnsi="Arial"/>
+                <w:color w:val="333333"/>
+                <w:sz w:val="20"/>
+                <w:szCs w:val="20"/>
+              </w:rPr>
+              <w:t xml:space="preserve">N/A</w:t>
             </w:r>
           </w:p>
         </w:tc>
@@ -812,24 +808,23 @@
               <w:bottom w:val="single" w:color="CCCCCC" w:sz="1"/>
               <w:right w:val="single" w:color="CCCCCC" w:sz="1"/>
             </w:tcBorders>
-            <w:shd w:fill="F5F9FC" w:val="clear"/>
-            <w:tcMar>
-              <w:top w:type="dxa" w:w="80"/>
-              <w:left w:type="dxa" w:w="120"/>
-              <w:bottom w:type="dxa" w:w="80"/>
-              <w:right w:type="dxa" w:w="120"/>
-            </w:tcMar>
-            <w:vAlign w:val="center"/>
-          </w:tcPr>
-          <w:p>
-            <w:r>
-              <w:rPr>
-                <w:rFonts w:ascii="Arial" w:cs="Arial" w:eastAsia="Arial" w:hAnsi="Arial"/>
-                <w:color w:val="333333"/>
-                <w:sz w:val="20"/>
-                <w:szCs w:val="20"/>
-              </w:rPr>
-              <w:t xml:space="preserve">Current snapshot (no lookback)</w:t>
+            <w:tcMar>
+              <w:top w:type="dxa" w:w="80"/>
+              <w:left w:type="dxa" w:w="120"/>
+              <w:bottom w:type="dxa" w:w="80"/>
+              <w:right w:type="dxa" w:w="120"/>
+            </w:tcMar>
+            <w:vAlign w:val="center"/>
+          </w:tcPr>
+          <w:p>
+            <w:r>
+              <w:rPr>
+                <w:rFonts w:ascii="Arial" w:cs="Arial" w:eastAsia="Arial" w:hAnsi="Arial"/>
+                <w:color w:val="333333"/>
+                <w:sz w:val="20"/>
+                <w:szCs w:val="20"/>
+              </w:rPr>
+              <w:t xml:space="preserve">N/A</w:t>
             </w:r>
           </w:p>
         </w:tc>
@@ -842,26 +837,25 @@
               <w:bottom w:val="single" w:color="CCCCCC" w:sz="1"/>
               <w:right w:val="single" w:color="CCCCCC" w:sz="1"/>
             </w:tcBorders>
-            <w:shd w:fill="F5F9FC" w:val="clear"/>
-            <w:tcMar>
-              <w:top w:type="dxa" w:w="80"/>
-              <w:left w:type="dxa" w:w="120"/>
-              <w:bottom w:type="dxa" w:w="80"/>
-              <w:right w:type="dxa" w:w="120"/>
-            </w:tcMar>
-            <w:vAlign w:val="center"/>
-          </w:tcPr>
-          <w:p>
-            <w:r>
-              <w:rPr>
-                <w:rFonts w:ascii="Arial" w:cs="Arial" w:eastAsia="Arial" w:hAnsi="Arial"/>
-                <w:b/>
-                <w:bCs/>
-                <w:color w:val="2E7D32"/>
-                <w:sz w:val="20"/>
-                <w:szCs w:val="20"/>
-              </w:rPr>
-              <w:t xml:space="preserve">Live</w:t>
+            <w:tcMar>
+              <w:top w:type="dxa" w:w="80"/>
+              <w:left w:type="dxa" w:w="120"/>
+              <w:bottom w:type="dxa" w:w="80"/>
+              <w:right w:type="dxa" w:w="120"/>
+            </w:tcMar>
+            <w:vAlign w:val="center"/>
+          </w:tcPr>
+          <w:p>
+            <w:r>
+              <w:rPr>
+                <w:rFonts w:ascii="Arial" w:cs="Arial" w:eastAsia="Arial" w:hAnsi="Arial"/>
+                <w:b/>
+                <w:bCs/>
+                <w:color w:val="B71C1C"/>
+                <w:sz w:val="20"/>
+                <w:szCs w:val="20"/>
+              </w:rPr>
+              <w:t xml:space="preserve">Dropped</w:t>
             </w:r>
           </w:p>
         </w:tc>
@@ -876,25 +870,26 @@
               <w:bottom w:val="single" w:color="CCCCCC" w:sz="1"/>
               <w:right w:val="single" w:color="CCCCCC" w:sz="1"/>
             </w:tcBorders>
-            <w:tcMar>
-              <w:top w:type="dxa" w:w="80"/>
-              <w:left w:type="dxa" w:w="120"/>
-              <w:bottom w:type="dxa" w:w="80"/>
-              <w:right w:type="dxa" w:w="120"/>
-            </w:tcMar>
-            <w:vAlign w:val="center"/>
-          </w:tcPr>
-          <w:p>
-            <w:r>
-              <w:rPr>
-                <w:rFonts w:ascii="Arial" w:cs="Arial" w:eastAsia="Arial" w:hAnsi="Arial"/>
-                <w:b/>
-                <w:bCs/>
-                <w:color w:val="333333"/>
-                <w:sz w:val="20"/>
-                <w:szCs w:val="20"/>
-              </w:rPr>
-              <w:t xml:space="preserve">S3</w:t>
+            <w:shd w:fill="F5F9FC" w:val="clear"/>
+            <w:tcMar>
+              <w:top w:type="dxa" w:w="80"/>
+              <w:left w:type="dxa" w:w="120"/>
+              <w:bottom w:type="dxa" w:w="80"/>
+              <w:right w:type="dxa" w:w="120"/>
+            </w:tcMar>
+            <w:vAlign w:val="center"/>
+          </w:tcPr>
+          <w:p>
+            <w:r>
+              <w:rPr>
+                <w:rFonts w:ascii="Arial" w:cs="Arial" w:eastAsia="Arial" w:hAnsi="Arial"/>
+                <w:b/>
+                <w:bCs/>
+                <w:color w:val="333333"/>
+                <w:sz w:val="20"/>
+                <w:szCs w:val="20"/>
+              </w:rPr>
+              <w:t xml:space="preserve">S4</w:t>
             </w:r>
           </w:p>
         </w:tc>
@@ -907,25 +902,26 @@
               <w:bottom w:val="single" w:color="CCCCCC" w:sz="1"/>
               <w:right w:val="single" w:color="CCCCCC" w:sz="1"/>
             </w:tcBorders>
-            <w:tcMar>
-              <w:top w:type="dxa" w:w="80"/>
-              <w:left w:type="dxa" w:w="120"/>
-              <w:bottom w:type="dxa" w:w="80"/>
-              <w:right w:type="dxa" w:w="120"/>
-            </w:tcMar>
-            <w:vAlign w:val="center"/>
-          </w:tcPr>
-          <w:p>
-            <w:r>
-              <w:rPr>
-                <w:rFonts w:ascii="Arial" w:cs="Arial" w:eastAsia="Arial" w:hAnsi="Arial"/>
-                <w:b/>
-                <w:bCs/>
-                <w:color w:val="333333"/>
-                <w:sz w:val="20"/>
-                <w:szCs w:val="20"/>
-              </w:rPr>
-              <w:t xml:space="preserve">New SKU Not Listed</w:t>
+            <w:shd w:fill="F5F9FC" w:val="clear"/>
+            <w:tcMar>
+              <w:top w:type="dxa" w:w="80"/>
+              <w:left w:type="dxa" w:w="120"/>
+              <w:bottom w:type="dxa" w:w="80"/>
+              <w:right w:type="dxa" w:w="120"/>
+            </w:tcMar>
+            <w:vAlign w:val="center"/>
+          </w:tcPr>
+          <w:p>
+            <w:r>
+              <w:rPr>
+                <w:rFonts w:ascii="Arial" w:cs="Arial" w:eastAsia="Arial" w:hAnsi="Arial"/>
+                <w:b/>
+                <w:bCs/>
+                <w:color w:val="333333"/>
+                <w:sz w:val="20"/>
+                <w:szCs w:val="20"/>
+              </w:rPr>
+              <w:t xml:space="preserve">Stockout Deactivation</w:t>
             </w:r>
           </w:p>
         </w:tc>
@@ -938,23 +934,24 @@
               <w:bottom w:val="single" w:color="CCCCCC" w:sz="1"/>
               <w:right w:val="single" w:color="CCCCCC" w:sz="1"/>
             </w:tcBorders>
-            <w:tcMar>
-              <w:top w:type="dxa" w:w="80"/>
-              <w:left w:type="dxa" w:w="120"/>
-              <w:bottom w:type="dxa" w:w="80"/>
-              <w:right w:type="dxa" w:w="120"/>
-            </w:tcMar>
-            <w:vAlign w:val="center"/>
-          </w:tcPr>
-          <w:p>
-            <w:r>
-              <w:rPr>
-                <w:rFonts w:ascii="Arial" w:cs="Arial" w:eastAsia="Arial" w:hAnsi="Arial"/>
-                <w:color w:val="333333"/>
-                <w:sz w:val="20"/>
-                <w:szCs w:val="20"/>
-              </w:rPr>
-              <w:t xml:space="preserve">Recently added SKUs not yet listed on any channel</w:t>
+            <w:shd w:fill="F5F9FC" w:val="clear"/>
+            <w:tcMar>
+              <w:top w:type="dxa" w:w="80"/>
+              <w:left w:type="dxa" w:w="120"/>
+              <w:bottom w:type="dxa" w:w="80"/>
+              <w:right w:type="dxa" w:w="120"/>
+            </w:tcMar>
+            <w:vAlign w:val="center"/>
+          </w:tcPr>
+          <w:p>
+            <w:r>
+              <w:rPr>
+                <w:rFonts w:ascii="Arial" w:cs="Arial" w:eastAsia="Arial" w:hAnsi="Arial"/>
+                <w:color w:val="333333"/>
+                <w:sz w:val="20"/>
+                <w:szCs w:val="20"/>
+              </w:rPr>
+              <w:t xml:space="preserve">Listings deactivated due to zero inventory</w:t>
             </w:r>
           </w:p>
         </w:tc>
@@ -967,6 +964,7 @@
               <w:bottom w:val="single" w:color="CCCCCC" w:sz="1"/>
               <w:right w:val="single" w:color="CCCCCC" w:sz="1"/>
             </w:tcBorders>
+            <w:shd w:fill="F5F9FC" w:val="clear"/>
             <w:tcMar>
               <w:top w:type="dxa" w:w="80"/>
               <w:left w:type="dxa" w:w="120"/>
@@ -996,6 +994,7 @@
               <w:bottom w:val="single" w:color="CCCCCC" w:sz="1"/>
               <w:right w:val="single" w:color="CCCCCC" w:sz="1"/>
             </w:tcBorders>
+            <w:shd w:fill="F5F9FC" w:val="clear"/>
             <w:tcMar>
               <w:top w:type="dxa" w:w="80"/>
               <w:left w:type="dxa" w:w="120"/>
@@ -1025,6 +1024,7 @@
               <w:bottom w:val="single" w:color="CCCCCC" w:sz="1"/>
               <w:right w:val="single" w:color="CCCCCC" w:sz="1"/>
             </w:tcBorders>
+            <w:shd w:fill="F5F9FC" w:val="clear"/>
             <w:tcMar>
               <w:top w:type="dxa" w:w="80"/>
               <w:left w:type="dxa" w:w="120"/>
@@ -1077,7 +1077,7 @@
                 <w:sz w:val="20"/>
                 <w:szCs w:val="20"/>
               </w:rPr>
-              <w:t xml:space="preserve">S4</w:t>
+              <w:t xml:space="preserve">S5</w:t>
             </w:r>
           </w:p>
         </w:tc>
@@ -1109,7 +1109,7 @@
                 <w:sz w:val="20"/>
                 <w:szCs w:val="20"/>
               </w:rPr>
-              <w:t xml:space="preserve">Stockout Deactivation</w:t>
+              <w:t xml:space="preserve">Inventory DOH Risk</w:t>
             </w:r>
           </w:p>
         </w:tc>
@@ -1139,7 +1139,7 @@
                 <w:sz w:val="20"/>
                 <w:szCs w:val="20"/>
               </w:rPr>
-              <w:t xml:space="preserve">Listings deactivated due to zero inventory</w:t>
+              <w:t xml:space="preserve">Bestseller SKUs (top 20% by sales volume per tenant) with low DOH. Tiered: STOCKOUT / CRITICAL / WARNING / WATCH. Impact shown as revenue at risk (daily velocity x avg price x 7-day window).</w:t>
             </w:r>
           </w:p>
         </w:tc>
@@ -1169,7 +1169,7 @@
                 <w:sz w:val="20"/>
                 <w:szCs w:val="20"/>
               </w:rPr>
-              <w:t xml:space="preserve">N/A</w:t>
+              <w:t xml:space="preserve">low_inventory + transaction (90d price)</w:t>
             </w:r>
           </w:p>
         </w:tc>
@@ -1199,7 +1199,7 @@
                 <w:sz w:val="20"/>
                 <w:szCs w:val="20"/>
               </w:rPr>
-              <w:t xml:space="preserve">N/A</w:t>
+              <w:t xml:space="preserve">30d velocity, 90d avg price</w:t>
             </w:r>
           </w:p>
         </w:tc>
@@ -1227,11 +1227,11 @@
                 <w:rFonts w:ascii="Arial" w:cs="Arial" w:eastAsia="Arial" w:hAnsi="Arial"/>
                 <w:b/>
                 <w:bCs/>
-                <w:color w:val="B71C1C"/>
-                <w:sz w:val="20"/>
-                <w:szCs w:val="20"/>
-              </w:rPr>
-              <w:t xml:space="preserve">Dropped</w:t>
+                <w:color w:val="2E7D32"/>
+                <w:sz w:val="20"/>
+                <w:szCs w:val="20"/>
+              </w:rPr>
+              <w:t xml:space="preserve">Live</w:t>
             </w:r>
           </w:p>
         </w:tc>
@@ -1264,7 +1264,7 @@
                 <w:sz w:val="20"/>
                 <w:szCs w:val="20"/>
               </w:rPr>
-              <w:t xml:space="preserve">S5</w:t>
+              <w:t xml:space="preserve">S6</w:t>
             </w:r>
           </w:p>
         </w:tc>
@@ -1295,7 +1295,7 @@
                 <w:sz w:val="20"/>
                 <w:szCs w:val="20"/>
               </w:rPr>
-              <w:t xml:space="preserve">Inventory DOH Risk</w:t>
+              <w:t xml:space="preserve">Return Rate Outlier</w:t>
             </w:r>
           </w:p>
         </w:tc>
@@ -1324,7 +1324,7 @@
                 <w:sz w:val="20"/>
                 <w:szCs w:val="20"/>
               </w:rPr>
-              <w:t xml:space="preserve">Bestseller SKUs (5+ sold/month) with low DOH. Tiered: STOCKOUT / CRITICAL / WARNING / WATCH. Impact shown as revenue at risk (daily velocity x avg price x 7-day window).</w:t>
+              <w:t xml:space="preserve">SKU + channel combos with return rates (RTO + CIR) above 10%. Excludes D2C. Filters: min 5 dispatched, min 2 returned.</w:t>
             </w:r>
           </w:p>
         </w:tc>
@@ -1353,7 +1353,7 @@
                 <w:sz w:val="20"/>
                 <w:szCs w:val="20"/>
               </w:rPr>
-              <w:t xml:space="preserve">low_inventory + transaction (90d price)</w:t>
+              <w:t xml:space="preserve">transaction__daily_v2_raw</w:t>
             </w:r>
           </w:p>
         </w:tc>
@@ -1382,7 +1382,7 @@
                 <w:sz w:val="20"/>
                 <w:szCs w:val="20"/>
               </w:rPr>
-              <w:t xml:space="preserve">30d velocity, 90d avg price</w:t>
+              <w:t xml:space="preserve">Rolling (90 days inferred)</w:t>
             </w:r>
           </w:p>
         </w:tc>
@@ -1447,7 +1447,7 @@
                 <w:sz w:val="20"/>
                 <w:szCs w:val="20"/>
               </w:rPr>
-              <w:t xml:space="preserve">S6</w:t>
+              <w:t xml:space="preserve">S7</w:t>
             </w:r>
           </w:p>
         </w:tc>
@@ -1479,7 +1479,7 @@
                 <w:sz w:val="20"/>
                 <w:szCs w:val="20"/>
               </w:rPr>
-              <w:t xml:space="preserve">Return Rate Outlier</w:t>
+              <w:t xml:space="preserve">Regional Concentration</w:t>
             </w:r>
           </w:p>
         </w:tc>
@@ -1509,7 +1509,7 @@
                 <w:sz w:val="20"/>
                 <w:szCs w:val="20"/>
               </w:rPr>
-              <w:t xml:space="preserve">SKU + channel combos with return rates (RTO + CIR) above 10%. Excludes D2C. Filters: min 5 dispatched, min 2 returned.</w:t>
+              <w:t xml:space="preserve">SKUs where a single state accounts for a disproportionate share of orders, indicating geographic risk or untapped expansion potential</w:t>
             </w:r>
           </w:p>
         </w:tc>
@@ -1569,7 +1569,7 @@
                 <w:sz w:val="20"/>
                 <w:szCs w:val="20"/>
               </w:rPr>
-              <w:t xml:space="preserve">Rolling (90 days inferred)</w:t>
+              <w:t xml:space="preserve">Last 30 days (revenue_30d)</w:t>
             </w:r>
           </w:p>
         </w:tc>
@@ -1583,188 +1583,6 @@
               <w:right w:val="single" w:color="CCCCCC" w:sz="1"/>
             </w:tcBorders>
             <w:shd w:fill="F5F9FC" w:val="clear"/>
-            <w:tcMar>
-              <w:top w:type="dxa" w:w="80"/>
-              <w:left w:type="dxa" w:w="120"/>
-              <w:bottom w:type="dxa" w:w="80"/>
-              <w:right w:type="dxa" w:w="120"/>
-            </w:tcMar>
-            <w:vAlign w:val="center"/>
-          </w:tcPr>
-          <w:p>
-            <w:r>
-              <w:rPr>
-                <w:rFonts w:ascii="Arial" w:cs="Arial" w:eastAsia="Arial" w:hAnsi="Arial"/>
-                <w:b/>
-                <w:bCs/>
-                <w:color w:val="2E7D32"/>
-                <w:sz w:val="20"/>
-                <w:szCs w:val="20"/>
-              </w:rPr>
-              <w:t xml:space="preserve">Live</w:t>
-            </w:r>
-          </w:p>
-        </w:tc>
-      </w:tr>
-      <w:tr>
-        <w:tc>
-          <w:tcPr>
-            <w:tcW w:type="dxa" w:w="500"/>
-            <w:tcBorders>
-              <w:top w:val="single" w:color="CCCCCC" w:sz="1"/>
-              <w:left w:val="single" w:color="CCCCCC" w:sz="1"/>
-              <w:bottom w:val="single" w:color="CCCCCC" w:sz="1"/>
-              <w:right w:val="single" w:color="CCCCCC" w:sz="1"/>
-            </w:tcBorders>
-            <w:tcMar>
-              <w:top w:type="dxa" w:w="80"/>
-              <w:left w:type="dxa" w:w="120"/>
-              <w:bottom w:type="dxa" w:w="80"/>
-              <w:right w:type="dxa" w:w="120"/>
-            </w:tcMar>
-            <w:vAlign w:val="center"/>
-          </w:tcPr>
-          <w:p>
-            <w:r>
-              <w:rPr>
-                <w:rFonts w:ascii="Arial" w:cs="Arial" w:eastAsia="Arial" w:hAnsi="Arial"/>
-                <w:b/>
-                <w:bCs/>
-                <w:color w:val="333333"/>
-                <w:sz w:val="20"/>
-                <w:szCs w:val="20"/>
-              </w:rPr>
-              <w:t xml:space="preserve">S7</w:t>
-            </w:r>
-          </w:p>
-        </w:tc>
-        <w:tc>
-          <w:tcPr>
-            <w:tcW w:type="dxa" w:w="1500"/>
-            <w:tcBorders>
-              <w:top w:val="single" w:color="CCCCCC" w:sz="1"/>
-              <w:left w:val="single" w:color="CCCCCC" w:sz="1"/>
-              <w:bottom w:val="single" w:color="CCCCCC" w:sz="1"/>
-              <w:right w:val="single" w:color="CCCCCC" w:sz="1"/>
-            </w:tcBorders>
-            <w:tcMar>
-              <w:top w:type="dxa" w:w="80"/>
-              <w:left w:type="dxa" w:w="120"/>
-              <w:bottom w:type="dxa" w:w="80"/>
-              <w:right w:type="dxa" w:w="120"/>
-            </w:tcMar>
-            <w:vAlign w:val="center"/>
-          </w:tcPr>
-          <w:p>
-            <w:r>
-              <w:rPr>
-                <w:rFonts w:ascii="Arial" w:cs="Arial" w:eastAsia="Arial" w:hAnsi="Arial"/>
-                <w:b/>
-                <w:bCs/>
-                <w:color w:val="333333"/>
-                <w:sz w:val="20"/>
-                <w:szCs w:val="20"/>
-              </w:rPr>
-              <w:t xml:space="preserve">Regional Concentration</w:t>
-            </w:r>
-          </w:p>
-        </w:tc>
-        <w:tc>
-          <w:tcPr>
-            <w:tcW w:type="dxa" w:w="2800"/>
-            <w:tcBorders>
-              <w:top w:val="single" w:color="CCCCCC" w:sz="1"/>
-              <w:left w:val="single" w:color="CCCCCC" w:sz="1"/>
-              <w:bottom w:val="single" w:color="CCCCCC" w:sz="1"/>
-              <w:right w:val="single" w:color="CCCCCC" w:sz="1"/>
-            </w:tcBorders>
-            <w:tcMar>
-              <w:top w:type="dxa" w:w="80"/>
-              <w:left w:type="dxa" w:w="120"/>
-              <w:bottom w:type="dxa" w:w="80"/>
-              <w:right w:type="dxa" w:w="120"/>
-            </w:tcMar>
-            <w:vAlign w:val="center"/>
-          </w:tcPr>
-          <w:p>
-            <w:r>
-              <w:rPr>
-                <w:rFonts w:ascii="Arial" w:cs="Arial" w:eastAsia="Arial" w:hAnsi="Arial"/>
-                <w:color w:val="333333"/>
-                <w:sz w:val="20"/>
-                <w:szCs w:val="20"/>
-              </w:rPr>
-              <w:t xml:space="preserve">SKUs where a single state accounts for a disproportionate share of orders, indicating geographic risk or untapped expansion potential</w:t>
-            </w:r>
-          </w:p>
-        </w:tc>
-        <w:tc>
-          <w:tcPr>
-            <w:tcW w:type="dxa" w:w="1600"/>
-            <w:tcBorders>
-              <w:top w:val="single" w:color="CCCCCC" w:sz="1"/>
-              <w:left w:val="single" w:color="CCCCCC" w:sz="1"/>
-              <w:bottom w:val="single" w:color="CCCCCC" w:sz="1"/>
-              <w:right w:val="single" w:color="CCCCCC" w:sz="1"/>
-            </w:tcBorders>
-            <w:tcMar>
-              <w:top w:type="dxa" w:w="80"/>
-              <w:left w:type="dxa" w:w="120"/>
-              <w:bottom w:type="dxa" w:w="80"/>
-              <w:right w:type="dxa" w:w="120"/>
-            </w:tcMar>
-            <w:vAlign w:val="center"/>
-          </w:tcPr>
-          <w:p>
-            <w:r>
-              <w:rPr>
-                <w:rFonts w:ascii="Arial" w:cs="Arial" w:eastAsia="Arial" w:hAnsi="Arial"/>
-                <w:color w:val="333333"/>
-                <w:sz w:val="20"/>
-                <w:szCs w:val="20"/>
-              </w:rPr>
-              <w:t xml:space="preserve">transaction__daily_v2_raw</w:t>
-            </w:r>
-          </w:p>
-        </w:tc>
-        <w:tc>
-          <w:tcPr>
-            <w:tcW w:type="dxa" w:w="1360"/>
-            <w:tcBorders>
-              <w:top w:val="single" w:color="CCCCCC" w:sz="1"/>
-              <w:left w:val="single" w:color="CCCCCC" w:sz="1"/>
-              <w:bottom w:val="single" w:color="CCCCCC" w:sz="1"/>
-              <w:right w:val="single" w:color="CCCCCC" w:sz="1"/>
-            </w:tcBorders>
-            <w:tcMar>
-              <w:top w:type="dxa" w:w="80"/>
-              <w:left w:type="dxa" w:w="120"/>
-              <w:bottom w:type="dxa" w:w="80"/>
-              <w:right w:type="dxa" w:w="120"/>
-            </w:tcMar>
-            <w:vAlign w:val="center"/>
-          </w:tcPr>
-          <w:p>
-            <w:r>
-              <w:rPr>
-                <w:rFonts w:ascii="Arial" w:cs="Arial" w:eastAsia="Arial" w:hAnsi="Arial"/>
-                <w:color w:val="333333"/>
-                <w:sz w:val="20"/>
-                <w:szCs w:val="20"/>
-              </w:rPr>
-              <w:t xml:space="preserve">Last 30 days (revenue_30d)</w:t>
-            </w:r>
-          </w:p>
-        </w:tc>
-        <w:tc>
-          <w:tcPr>
-            <w:tcW w:type="dxa" w:w="1000"/>
-            <w:tcBorders>
-              <w:top w:val="single" w:color="CCCCCC" w:sz="1"/>
-              <w:left w:val="single" w:color="CCCCCC" w:sz="1"/>
-              <w:bottom w:val="single" w:color="CCCCCC" w:sz="1"/>
-              <w:right w:val="single" w:color="CCCCCC" w:sz="1"/>
-            </w:tcBorders>
             <w:tcMar>
               <w:top w:type="dxa" w:w="80"/>
               <w:left w:type="dxa" w:w="120"/>
@@ -2168,18 +1986,17 @@
         </w:tblBorders>
       </w:tblPr>
       <w:tblGrid>
-        <w:gridCol w:w="2200"/>
-        <w:gridCol w:w="1200"/>
-        <w:gridCol w:w="1200"/>
-        <w:gridCol w:w="1200"/>
-        <w:gridCol w:w="1200"/>
-        <w:gridCol w:w="1200"/>
-        <w:gridCol w:w="1160"/>
+        <w:gridCol w:w="2400"/>
+        <w:gridCol w:w="1500"/>
+        <w:gridCol w:w="1400"/>
+        <w:gridCol w:w="1400"/>
+        <w:gridCol w:w="1400"/>
+        <w:gridCol w:w="1260"/>
       </w:tblGrid>
       <w:tr>
         <w:tc>
           <w:tcPr>
-            <w:tcW w:type="dxa" w:w="2200"/>
+            <w:tcW w:type="dxa" w:w="2400"/>
             <w:tcBorders>
               <w:top w:val="single" w:color="CCCCCC" w:sz="1"/>
               <w:left w:val="single" w:color="CCCCCC" w:sz="1"/>
@@ -2211,7 +2028,7 @@
         </w:tc>
         <w:tc>
           <w:tcPr>
-            <w:tcW w:type="dxa" w:w="1200"/>
+            <w:tcW w:type="dxa" w:w="1500"/>
             <w:tcBorders>
               <w:top w:val="single" w:color="CCCCCC" w:sz="1"/>
               <w:left w:val="single" w:color="CCCCCC" w:sz="1"/>
@@ -2237,13 +2054,13 @@
                 <w:sz w:val="20"/>
                 <w:szCs w:val="20"/>
               </w:rPr>
-              <w:t xml:space="preserve">S1</w:t>
-            </w:r>
-          </w:p>
-        </w:tc>
-        <w:tc>
-          <w:tcPr>
-            <w:tcW w:type="dxa" w:w="1200"/>
+              <w:t xml:space="preserve">S1/S2</w:t>
+            </w:r>
+          </w:p>
+        </w:tc>
+        <w:tc>
+          <w:tcPr>
+            <w:tcW w:type="dxa" w:w="1400"/>
             <w:tcBorders>
               <w:top w:val="single" w:color="CCCCCC" w:sz="1"/>
               <w:left w:val="single" w:color="CCCCCC" w:sz="1"/>
@@ -2269,13 +2086,13 @@
                 <w:sz w:val="20"/>
                 <w:szCs w:val="20"/>
               </w:rPr>
-              <w:t xml:space="preserve">S2</w:t>
-            </w:r>
-          </w:p>
-        </w:tc>
-        <w:tc>
-          <w:tcPr>
-            <w:tcW w:type="dxa" w:w="1200"/>
+              <w:t xml:space="preserve">S5</w:t>
+            </w:r>
+          </w:p>
+        </w:tc>
+        <w:tc>
+          <w:tcPr>
+            <w:tcW w:type="dxa" w:w="1400"/>
             <w:tcBorders>
               <w:top w:val="single" w:color="CCCCCC" w:sz="1"/>
               <w:left w:val="single" w:color="CCCCCC" w:sz="1"/>
@@ -2301,13 +2118,13 @@
                 <w:sz w:val="20"/>
                 <w:szCs w:val="20"/>
               </w:rPr>
-              <w:t xml:space="preserve">S5</w:t>
-            </w:r>
-          </w:p>
-        </w:tc>
-        <w:tc>
-          <w:tcPr>
-            <w:tcW w:type="dxa" w:w="1200"/>
+              <w:t xml:space="preserve">S6</w:t>
+            </w:r>
+          </w:p>
+        </w:tc>
+        <w:tc>
+          <w:tcPr>
+            <w:tcW w:type="dxa" w:w="1400"/>
             <w:tcBorders>
               <w:top w:val="single" w:color="CCCCCC" w:sz="1"/>
               <w:left w:val="single" w:color="CCCCCC" w:sz="1"/>
@@ -2333,45 +2150,13 @@
                 <w:sz w:val="20"/>
                 <w:szCs w:val="20"/>
               </w:rPr>
-              <w:t xml:space="preserve">S6</w:t>
-            </w:r>
-          </w:p>
-        </w:tc>
-        <w:tc>
-          <w:tcPr>
-            <w:tcW w:type="dxa" w:w="1200"/>
-            <w:tcBorders>
-              <w:top w:val="single" w:color="CCCCCC" w:sz="1"/>
-              <w:left w:val="single" w:color="CCCCCC" w:sz="1"/>
-              <w:bottom w:val="single" w:color="CCCCCC" w:sz="1"/>
-              <w:right w:val="single" w:color="CCCCCC" w:sz="1"/>
-            </w:tcBorders>
-            <w:shd w:fill="1F87C2" w:val="clear"/>
-            <w:tcMar>
-              <w:top w:type="dxa" w:w="80"/>
-              <w:left w:type="dxa" w:w="120"/>
-              <w:bottom w:type="dxa" w:w="80"/>
-              <w:right w:type="dxa" w:w="120"/>
-            </w:tcMar>
-            <w:vAlign w:val="center"/>
-          </w:tcPr>
-          <w:p>
-            <w:r>
-              <w:rPr>
-                <w:rFonts w:ascii="Arial" w:cs="Arial" w:eastAsia="Arial" w:hAnsi="Arial"/>
-                <w:b/>
-                <w:bCs/>
-                <w:color w:val="FFFFFF"/>
-                <w:sz w:val="20"/>
-                <w:szCs w:val="20"/>
-              </w:rPr>
               <w:t xml:space="preserve">S7</w:t>
             </w:r>
           </w:p>
         </w:tc>
         <w:tc>
           <w:tcPr>
-            <w:tcW w:type="dxa" w:w="1160"/>
+            <w:tcW w:type="dxa" w:w="1260"/>
             <w:tcBorders>
               <w:top w:val="single" w:color="CCCCCC" w:sz="1"/>
               <w:left w:val="single" w:color="CCCCCC" w:sz="1"/>
@@ -2405,7 +2190,7 @@
       <w:tr>
         <w:tc>
           <w:tcPr>
-            <w:tcW w:type="dxa" w:w="2200"/>
+            <w:tcW w:type="dxa" w:w="2400"/>
             <w:tcBorders>
               <w:top w:val="single" w:color="CCCCCC" w:sz="1"/>
               <w:left w:val="single" w:color="CCCCCC" w:sz="1"/>
@@ -2436,7 +2221,7 @@
         </w:tc>
         <w:tc>
           <w:tcPr>
-            <w:tcW w:type="dxa" w:w="1200"/>
+            <w:tcW w:type="dxa" w:w="1500"/>
             <w:tcBorders>
               <w:top w:val="single" w:color="CCCCCC" w:sz="1"/>
               <w:left w:val="single" w:color="CCCCCC" w:sz="1"/>
@@ -2465,7 +2250,7 @@
         </w:tc>
         <w:tc>
           <w:tcPr>
-            <w:tcW w:type="dxa" w:w="1200"/>
+            <w:tcW w:type="dxa" w:w="1400"/>
             <w:tcBorders>
               <w:top w:val="single" w:color="CCCCCC" w:sz="1"/>
               <w:left w:val="single" w:color="CCCCCC" w:sz="1"/>
@@ -2494,7 +2279,7 @@
         </w:tc>
         <w:tc>
           <w:tcPr>
-            <w:tcW w:type="dxa" w:w="1200"/>
+            <w:tcW w:type="dxa" w:w="1400"/>
             <w:tcBorders>
               <w:top w:val="single" w:color="CCCCCC" w:sz="1"/>
               <w:left w:val="single" w:color="CCCCCC" w:sz="1"/>
@@ -2523,36 +2308,7 @@
         </w:tc>
         <w:tc>
           <w:tcPr>
-            <w:tcW w:type="dxa" w:w="1200"/>
-            <w:tcBorders>
-              <w:top w:val="single" w:color="CCCCCC" w:sz="1"/>
-              <w:left w:val="single" w:color="CCCCCC" w:sz="1"/>
-              <w:bottom w:val="single" w:color="CCCCCC" w:sz="1"/>
-              <w:right w:val="single" w:color="CCCCCC" w:sz="1"/>
-            </w:tcBorders>
-            <w:tcMar>
-              <w:top w:type="dxa" w:w="80"/>
-              <w:left w:type="dxa" w:w="120"/>
-              <w:bottom w:type="dxa" w:w="80"/>
-              <w:right w:type="dxa" w:w="120"/>
-            </w:tcMar>
-            <w:vAlign w:val="center"/>
-          </w:tcPr>
-          <w:p>
-            <w:r>
-              <w:rPr>
-                <w:rFonts w:ascii="Arial" w:cs="Arial" w:eastAsia="Arial" w:hAnsi="Arial"/>
-                <w:color w:val="2E7D32"/>
-                <w:sz w:val="20"/>
-                <w:szCs w:val="20"/>
-              </w:rPr>
-              <w:t xml:space="preserve">✓</w:t>
-            </w:r>
-          </w:p>
-        </w:tc>
-        <w:tc>
-          <w:tcPr>
-            <w:tcW w:type="dxa" w:w="1200"/>
+            <w:tcW w:type="dxa" w:w="1400"/>
             <w:tcBorders>
               <w:top w:val="single" w:color="CCCCCC" w:sz="1"/>
               <w:left w:val="single" w:color="CCCCCC" w:sz="1"/>
@@ -2581,32 +2337,32 @@
         </w:tc>
         <w:tc>
           <w:tcPr>
-            <w:tcW w:type="dxa" w:w="1160"/>
-            <w:tcBorders>
-              <w:top w:val="single" w:color="CCCCCC" w:sz="1"/>
-              <w:left w:val="single" w:color="CCCCCC" w:sz="1"/>
-              <w:bottom w:val="single" w:color="CCCCCC" w:sz="1"/>
-              <w:right w:val="single" w:color="CCCCCC" w:sz="1"/>
-            </w:tcBorders>
-            <w:tcMar>
-              <w:top w:type="dxa" w:w="80"/>
-              <w:left w:type="dxa" w:w="120"/>
-              <w:bottom w:type="dxa" w:w="80"/>
-              <w:right w:type="dxa" w:w="120"/>
-            </w:tcMar>
-            <w:vAlign w:val="center"/>
-          </w:tcPr>
-          <w:p>
-            <w:r>
-              <w:rPr>
-                <w:rFonts w:ascii="Arial" w:cs="Arial" w:eastAsia="Arial" w:hAnsi="Arial"/>
-                <w:b/>
-                <w:bCs/>
-                <w:color w:val="333333"/>
-                <w:sz w:val="20"/>
-                <w:szCs w:val="20"/>
-              </w:rPr>
-              <w:t xml:space="preserve">4</w:t>
+            <w:tcW w:type="dxa" w:w="1260"/>
+            <w:tcBorders>
+              <w:top w:val="single" w:color="CCCCCC" w:sz="1"/>
+              <w:left w:val="single" w:color="CCCCCC" w:sz="1"/>
+              <w:bottom w:val="single" w:color="CCCCCC" w:sz="1"/>
+              <w:right w:val="single" w:color="CCCCCC" w:sz="1"/>
+            </w:tcBorders>
+            <w:tcMar>
+              <w:top w:type="dxa" w:w="80"/>
+              <w:left w:type="dxa" w:w="120"/>
+              <w:bottom w:type="dxa" w:w="80"/>
+              <w:right w:type="dxa" w:w="120"/>
+            </w:tcMar>
+            <w:vAlign w:val="center"/>
+          </w:tcPr>
+          <w:p>
+            <w:r>
+              <w:rPr>
+                <w:rFonts w:ascii="Arial" w:cs="Arial" w:eastAsia="Arial" w:hAnsi="Arial"/>
+                <w:b/>
+                <w:bCs/>
+                <w:color w:val="333333"/>
+                <w:sz w:val="20"/>
+                <w:szCs w:val="20"/>
+              </w:rPr>
+              <w:t xml:space="preserve">3</w:t>
             </w:r>
           </w:p>
         </w:tc>
@@ -2614,7 +2370,7 @@
       <w:tr>
         <w:tc>
           <w:tcPr>
-            <w:tcW w:type="dxa" w:w="2200"/>
+            <w:tcW w:type="dxa" w:w="2400"/>
             <w:tcBorders>
               <w:top w:val="single" w:color="CCCCCC" w:sz="1"/>
               <w:left w:val="single" w:color="CCCCCC" w:sz="1"/>
@@ -2646,7 +2402,7 @@
         </w:tc>
         <w:tc>
           <w:tcPr>
-            <w:tcW w:type="dxa" w:w="1200"/>
+            <w:tcW w:type="dxa" w:w="1500"/>
             <w:tcBorders>
               <w:top w:val="single" w:color="CCCCCC" w:sz="1"/>
               <w:left w:val="single" w:color="CCCCCC" w:sz="1"/>
@@ -2676,7 +2432,7 @@
         </w:tc>
         <w:tc>
           <w:tcPr>
-            <w:tcW w:type="dxa" w:w="1200"/>
+            <w:tcW w:type="dxa" w:w="1400"/>
             <w:tcBorders>
               <w:top w:val="single" w:color="CCCCCC" w:sz="1"/>
               <w:left w:val="single" w:color="CCCCCC" w:sz="1"/>
@@ -2706,7 +2462,7 @@
         </w:tc>
         <w:tc>
           <w:tcPr>
-            <w:tcW w:type="dxa" w:w="1200"/>
+            <w:tcW w:type="dxa" w:w="1400"/>
             <w:tcBorders>
               <w:top w:val="single" w:color="CCCCCC" w:sz="1"/>
               <w:left w:val="single" w:color="CCCCCC" w:sz="1"/>
@@ -2736,37 +2492,7 @@
         </w:tc>
         <w:tc>
           <w:tcPr>
-            <w:tcW w:type="dxa" w:w="1200"/>
-            <w:tcBorders>
-              <w:top w:val="single" w:color="CCCCCC" w:sz="1"/>
-              <w:left w:val="single" w:color="CCCCCC" w:sz="1"/>
-              <w:bottom w:val="single" w:color="CCCCCC" w:sz="1"/>
-              <w:right w:val="single" w:color="CCCCCC" w:sz="1"/>
-            </w:tcBorders>
-            <w:shd w:fill="F5F9FC" w:val="clear"/>
-            <w:tcMar>
-              <w:top w:type="dxa" w:w="80"/>
-              <w:left w:type="dxa" w:w="120"/>
-              <w:bottom w:type="dxa" w:w="80"/>
-              <w:right w:type="dxa" w:w="120"/>
-            </w:tcMar>
-            <w:vAlign w:val="center"/>
-          </w:tcPr>
-          <w:p>
-            <w:r>
-              <w:rPr>
-                <w:rFonts w:ascii="Arial" w:cs="Arial" w:eastAsia="Arial" w:hAnsi="Arial"/>
-                <w:color w:val="2E7D32"/>
-                <w:sz w:val="20"/>
-                <w:szCs w:val="20"/>
-              </w:rPr>
-              <w:t xml:space="preserve">✓</w:t>
-            </w:r>
-          </w:p>
-        </w:tc>
-        <w:tc>
-          <w:tcPr>
-            <w:tcW w:type="dxa" w:w="1200"/>
+            <w:tcW w:type="dxa" w:w="1400"/>
             <w:tcBorders>
               <w:top w:val="single" w:color="CCCCCC" w:sz="1"/>
               <w:left w:val="single" w:color="CCCCCC" w:sz="1"/>
@@ -2796,33 +2522,33 @@
         </w:tc>
         <w:tc>
           <w:tcPr>
-            <w:tcW w:type="dxa" w:w="1160"/>
-            <w:tcBorders>
-              <w:top w:val="single" w:color="CCCCCC" w:sz="1"/>
-              <w:left w:val="single" w:color="CCCCCC" w:sz="1"/>
-              <w:bottom w:val="single" w:color="CCCCCC" w:sz="1"/>
-              <w:right w:val="single" w:color="CCCCCC" w:sz="1"/>
-            </w:tcBorders>
-            <w:shd w:fill="F5F9FC" w:val="clear"/>
-            <w:tcMar>
-              <w:top w:type="dxa" w:w="80"/>
-              <w:left w:type="dxa" w:w="120"/>
-              <w:bottom w:type="dxa" w:w="80"/>
-              <w:right w:type="dxa" w:w="120"/>
-            </w:tcMar>
-            <w:vAlign w:val="center"/>
-          </w:tcPr>
-          <w:p>
-            <w:r>
-              <w:rPr>
-                <w:rFonts w:ascii="Arial" w:cs="Arial" w:eastAsia="Arial" w:hAnsi="Arial"/>
-                <w:b/>
-                <w:bCs/>
-                <w:color w:val="333333"/>
-                <w:sz w:val="20"/>
-                <w:szCs w:val="20"/>
-              </w:rPr>
-              <w:t xml:space="preserve">4</w:t>
+            <w:tcW w:type="dxa" w:w="1260"/>
+            <w:tcBorders>
+              <w:top w:val="single" w:color="CCCCCC" w:sz="1"/>
+              <w:left w:val="single" w:color="CCCCCC" w:sz="1"/>
+              <w:bottom w:val="single" w:color="CCCCCC" w:sz="1"/>
+              <w:right w:val="single" w:color="CCCCCC" w:sz="1"/>
+            </w:tcBorders>
+            <w:shd w:fill="F5F9FC" w:val="clear"/>
+            <w:tcMar>
+              <w:top w:type="dxa" w:w="80"/>
+              <w:left w:type="dxa" w:w="120"/>
+              <w:bottom w:type="dxa" w:w="80"/>
+              <w:right w:type="dxa" w:w="120"/>
+            </w:tcMar>
+            <w:vAlign w:val="center"/>
+          </w:tcPr>
+          <w:p>
+            <w:r>
+              <w:rPr>
+                <w:rFonts w:ascii="Arial" w:cs="Arial" w:eastAsia="Arial" w:hAnsi="Arial"/>
+                <w:b/>
+                <w:bCs/>
+                <w:color w:val="333333"/>
+                <w:sz w:val="20"/>
+                <w:szCs w:val="20"/>
+              </w:rPr>
+              <w:t xml:space="preserve">3</w:t>
             </w:r>
           </w:p>
         </w:tc>
@@ -2830,7 +2556,7 @@
       <w:tr>
         <w:tc>
           <w:tcPr>
-            <w:tcW w:type="dxa" w:w="2200"/>
+            <w:tcW w:type="dxa" w:w="2400"/>
             <w:tcBorders>
               <w:top w:val="single" w:color="CCCCCC" w:sz="1"/>
               <w:left w:val="single" w:color="CCCCCC" w:sz="1"/>
@@ -2861,7 +2587,7 @@
         </w:tc>
         <w:tc>
           <w:tcPr>
-            <w:tcW w:type="dxa" w:w="1200"/>
+            <w:tcW w:type="dxa" w:w="1500"/>
             <w:tcBorders>
               <w:top w:val="single" w:color="CCCCCC" w:sz="1"/>
               <w:left w:val="single" w:color="CCCCCC" w:sz="1"/>
@@ -2890,7 +2616,7 @@
         </w:tc>
         <w:tc>
           <w:tcPr>
-            <w:tcW w:type="dxa" w:w="1200"/>
+            <w:tcW w:type="dxa" w:w="1400"/>
             <w:tcBorders>
               <w:top w:val="single" w:color="CCCCCC" w:sz="1"/>
               <w:left w:val="single" w:color="CCCCCC" w:sz="1"/>
@@ -2919,7 +2645,7 @@
         </w:tc>
         <w:tc>
           <w:tcPr>
-            <w:tcW w:type="dxa" w:w="1200"/>
+            <w:tcW w:type="dxa" w:w="1400"/>
             <w:tcBorders>
               <w:top w:val="single" w:color="CCCCCC" w:sz="1"/>
               <w:left w:val="single" w:color="CCCCCC" w:sz="1"/>
@@ -2948,36 +2674,7 @@
         </w:tc>
         <w:tc>
           <w:tcPr>
-            <w:tcW w:type="dxa" w:w="1200"/>
-            <w:tcBorders>
-              <w:top w:val="single" w:color="CCCCCC" w:sz="1"/>
-              <w:left w:val="single" w:color="CCCCCC" w:sz="1"/>
-              <w:bottom w:val="single" w:color="CCCCCC" w:sz="1"/>
-              <w:right w:val="single" w:color="CCCCCC" w:sz="1"/>
-            </w:tcBorders>
-            <w:tcMar>
-              <w:top w:type="dxa" w:w="80"/>
-              <w:left w:type="dxa" w:w="120"/>
-              <w:bottom w:type="dxa" w:w="80"/>
-              <w:right w:type="dxa" w:w="120"/>
-            </w:tcMar>
-            <w:vAlign w:val="center"/>
-          </w:tcPr>
-          <w:p>
-            <w:r>
-              <w:rPr>
-                <w:rFonts w:ascii="Arial" w:cs="Arial" w:eastAsia="Arial" w:hAnsi="Arial"/>
-                <w:color w:val="2E7D32"/>
-                <w:sz w:val="20"/>
-                <w:szCs w:val="20"/>
-              </w:rPr>
-              <w:t xml:space="preserve">✓</w:t>
-            </w:r>
-          </w:p>
-        </w:tc>
-        <w:tc>
-          <w:tcPr>
-            <w:tcW w:type="dxa" w:w="1200"/>
+            <w:tcW w:type="dxa" w:w="1400"/>
             <w:tcBorders>
               <w:top w:val="single" w:color="CCCCCC" w:sz="1"/>
               <w:left w:val="single" w:color="CCCCCC" w:sz="1"/>
@@ -3006,32 +2703,32 @@
         </w:tc>
         <w:tc>
           <w:tcPr>
-            <w:tcW w:type="dxa" w:w="1160"/>
-            <w:tcBorders>
-              <w:top w:val="single" w:color="CCCCCC" w:sz="1"/>
-              <w:left w:val="single" w:color="CCCCCC" w:sz="1"/>
-              <w:bottom w:val="single" w:color="CCCCCC" w:sz="1"/>
-              <w:right w:val="single" w:color="CCCCCC" w:sz="1"/>
-            </w:tcBorders>
-            <w:tcMar>
-              <w:top w:type="dxa" w:w="80"/>
-              <w:left w:type="dxa" w:w="120"/>
-              <w:bottom w:type="dxa" w:w="80"/>
-              <w:right w:type="dxa" w:w="120"/>
-            </w:tcMar>
-            <w:vAlign w:val="center"/>
-          </w:tcPr>
-          <w:p>
-            <w:r>
-              <w:rPr>
-                <w:rFonts w:ascii="Arial" w:cs="Arial" w:eastAsia="Arial" w:hAnsi="Arial"/>
-                <w:b/>
-                <w:bCs/>
-                <w:color w:val="333333"/>
-                <w:sz w:val="20"/>
-                <w:szCs w:val="20"/>
-              </w:rPr>
-              <w:t xml:space="preserve">4</w:t>
+            <w:tcW w:type="dxa" w:w="1260"/>
+            <w:tcBorders>
+              <w:top w:val="single" w:color="CCCCCC" w:sz="1"/>
+              <w:left w:val="single" w:color="CCCCCC" w:sz="1"/>
+              <w:bottom w:val="single" w:color="CCCCCC" w:sz="1"/>
+              <w:right w:val="single" w:color="CCCCCC" w:sz="1"/>
+            </w:tcBorders>
+            <w:tcMar>
+              <w:top w:type="dxa" w:w="80"/>
+              <w:left w:type="dxa" w:w="120"/>
+              <w:bottom w:type="dxa" w:w="80"/>
+              <w:right w:type="dxa" w:w="120"/>
+            </w:tcMar>
+            <w:vAlign w:val="center"/>
+          </w:tcPr>
+          <w:p>
+            <w:r>
+              <w:rPr>
+                <w:rFonts w:ascii="Arial" w:cs="Arial" w:eastAsia="Arial" w:hAnsi="Arial"/>
+                <w:b/>
+                <w:bCs/>
+                <w:color w:val="333333"/>
+                <w:sz w:val="20"/>
+                <w:szCs w:val="20"/>
+              </w:rPr>
+              <w:t xml:space="preserve">3</w:t>
             </w:r>
           </w:p>
         </w:tc>
@@ -3039,7 +2736,7 @@
       <w:tr>
         <w:tc>
           <w:tcPr>
-            <w:tcW w:type="dxa" w:w="2200"/>
+            <w:tcW w:type="dxa" w:w="2400"/>
             <w:tcBorders>
               <w:top w:val="single" w:color="CCCCCC" w:sz="1"/>
               <w:left w:val="single" w:color="CCCCCC" w:sz="1"/>
@@ -3071,7 +2768,97 @@
         </w:tc>
         <w:tc>
           <w:tcPr>
-            <w:tcW w:type="dxa" w:w="1200"/>
+            <w:tcW w:type="dxa" w:w="1500"/>
+            <w:tcBorders>
+              <w:top w:val="single" w:color="CCCCCC" w:sz="1"/>
+              <w:left w:val="single" w:color="CCCCCC" w:sz="1"/>
+              <w:bottom w:val="single" w:color="CCCCCC" w:sz="1"/>
+              <w:right w:val="single" w:color="CCCCCC" w:sz="1"/>
+            </w:tcBorders>
+            <w:shd w:fill="F5F9FC" w:val="clear"/>
+            <w:tcMar>
+              <w:top w:type="dxa" w:w="80"/>
+              <w:left w:type="dxa" w:w="120"/>
+              <w:bottom w:type="dxa" w:w="80"/>
+              <w:right w:type="dxa" w:w="120"/>
+            </w:tcMar>
+            <w:vAlign w:val="center"/>
+          </w:tcPr>
+          <w:p>
+            <w:r>
+              <w:rPr>
+                <w:rFonts w:ascii="Arial" w:cs="Arial" w:eastAsia="Arial" w:hAnsi="Arial"/>
+                <w:color w:val="2E7D32"/>
+                <w:sz w:val="20"/>
+                <w:szCs w:val="20"/>
+              </w:rPr>
+              <w:t xml:space="preserve">✓</w:t>
+            </w:r>
+          </w:p>
+        </w:tc>
+        <w:tc>
+          <w:tcPr>
+            <w:tcW w:type="dxa" w:w="1400"/>
+            <w:tcBorders>
+              <w:top w:val="single" w:color="CCCCCC" w:sz="1"/>
+              <w:left w:val="single" w:color="CCCCCC" w:sz="1"/>
+              <w:bottom w:val="single" w:color="CCCCCC" w:sz="1"/>
+              <w:right w:val="single" w:color="CCCCCC" w:sz="1"/>
+            </w:tcBorders>
+            <w:shd w:fill="F5F9FC" w:val="clear"/>
+            <w:tcMar>
+              <w:top w:type="dxa" w:w="80"/>
+              <w:left w:type="dxa" w:w="120"/>
+              <w:bottom w:type="dxa" w:w="80"/>
+              <w:right w:type="dxa" w:w="120"/>
+            </w:tcMar>
+            <w:vAlign w:val="center"/>
+          </w:tcPr>
+          <w:p>
+            <w:r>
+              <w:rPr>
+                <w:rFonts w:ascii="Arial" w:cs="Arial" w:eastAsia="Arial" w:hAnsi="Arial"/>
+                <w:color w:val="2E7D32"/>
+                <w:sz w:val="20"/>
+                <w:szCs w:val="20"/>
+              </w:rPr>
+              <w:t xml:space="preserve">✓</w:t>
+            </w:r>
+          </w:p>
+        </w:tc>
+        <w:tc>
+          <w:tcPr>
+            <w:tcW w:type="dxa" w:w="1400"/>
+            <w:tcBorders>
+              <w:top w:val="single" w:color="CCCCCC" w:sz="1"/>
+              <w:left w:val="single" w:color="CCCCCC" w:sz="1"/>
+              <w:bottom w:val="single" w:color="CCCCCC" w:sz="1"/>
+              <w:right w:val="single" w:color="CCCCCC" w:sz="1"/>
+            </w:tcBorders>
+            <w:shd w:fill="F5F9FC" w:val="clear"/>
+            <w:tcMar>
+              <w:top w:type="dxa" w:w="80"/>
+              <w:left w:type="dxa" w:w="120"/>
+              <w:bottom w:type="dxa" w:w="80"/>
+              <w:right w:type="dxa" w:w="120"/>
+            </w:tcMar>
+            <w:vAlign w:val="center"/>
+          </w:tcPr>
+          <w:p>
+            <w:r>
+              <w:rPr>
+                <w:rFonts w:ascii="Arial" w:cs="Arial" w:eastAsia="Arial" w:hAnsi="Arial"/>
+                <w:color w:val="2E7D32"/>
+                <w:sz w:val="20"/>
+                <w:szCs w:val="20"/>
+              </w:rPr>
+              <w:t xml:space="preserve">✓</w:t>
+            </w:r>
+          </w:p>
+        </w:tc>
+        <w:tc>
+          <w:tcPr>
+            <w:tcW w:type="dxa" w:w="1400"/>
             <w:tcBorders>
               <w:top w:val="single" w:color="CCCCCC" w:sz="1"/>
               <w:left w:val="single" w:color="CCCCCC" w:sz="1"/>
@@ -3101,127 +2888,7 @@
         </w:tc>
         <w:tc>
           <w:tcPr>
-            <w:tcW w:type="dxa" w:w="1200"/>
-            <w:tcBorders>
-              <w:top w:val="single" w:color="CCCCCC" w:sz="1"/>
-              <w:left w:val="single" w:color="CCCCCC" w:sz="1"/>
-              <w:bottom w:val="single" w:color="CCCCCC" w:sz="1"/>
-              <w:right w:val="single" w:color="CCCCCC" w:sz="1"/>
-            </w:tcBorders>
-            <w:shd w:fill="F5F9FC" w:val="clear"/>
-            <w:tcMar>
-              <w:top w:type="dxa" w:w="80"/>
-              <w:left w:type="dxa" w:w="120"/>
-              <w:bottom w:type="dxa" w:w="80"/>
-              <w:right w:type="dxa" w:w="120"/>
-            </w:tcMar>
-            <w:vAlign w:val="center"/>
-          </w:tcPr>
-          <w:p>
-            <w:r>
-              <w:rPr>
-                <w:rFonts w:ascii="Arial" w:cs="Arial" w:eastAsia="Arial" w:hAnsi="Arial"/>
-                <w:color w:val="2E7D32"/>
-                <w:sz w:val="20"/>
-                <w:szCs w:val="20"/>
-              </w:rPr>
-              <w:t xml:space="preserve">✓</w:t>
-            </w:r>
-          </w:p>
-        </w:tc>
-        <w:tc>
-          <w:tcPr>
-            <w:tcW w:type="dxa" w:w="1200"/>
-            <w:tcBorders>
-              <w:top w:val="single" w:color="CCCCCC" w:sz="1"/>
-              <w:left w:val="single" w:color="CCCCCC" w:sz="1"/>
-              <w:bottom w:val="single" w:color="CCCCCC" w:sz="1"/>
-              <w:right w:val="single" w:color="CCCCCC" w:sz="1"/>
-            </w:tcBorders>
-            <w:shd w:fill="F5F9FC" w:val="clear"/>
-            <w:tcMar>
-              <w:top w:type="dxa" w:w="80"/>
-              <w:left w:type="dxa" w:w="120"/>
-              <w:bottom w:type="dxa" w:w="80"/>
-              <w:right w:type="dxa" w:w="120"/>
-            </w:tcMar>
-            <w:vAlign w:val="center"/>
-          </w:tcPr>
-          <w:p>
-            <w:r>
-              <w:rPr>
-                <w:rFonts w:ascii="Arial" w:cs="Arial" w:eastAsia="Arial" w:hAnsi="Arial"/>
-                <w:color w:val="2E7D32"/>
-                <w:sz w:val="20"/>
-                <w:szCs w:val="20"/>
-              </w:rPr>
-              <w:t xml:space="preserve">✓</w:t>
-            </w:r>
-          </w:p>
-        </w:tc>
-        <w:tc>
-          <w:tcPr>
-            <w:tcW w:type="dxa" w:w="1200"/>
-            <w:tcBorders>
-              <w:top w:val="single" w:color="CCCCCC" w:sz="1"/>
-              <w:left w:val="single" w:color="CCCCCC" w:sz="1"/>
-              <w:bottom w:val="single" w:color="CCCCCC" w:sz="1"/>
-              <w:right w:val="single" w:color="CCCCCC" w:sz="1"/>
-            </w:tcBorders>
-            <w:shd w:fill="F5F9FC" w:val="clear"/>
-            <w:tcMar>
-              <w:top w:type="dxa" w:w="80"/>
-              <w:left w:type="dxa" w:w="120"/>
-              <w:bottom w:type="dxa" w:w="80"/>
-              <w:right w:type="dxa" w:w="120"/>
-            </w:tcMar>
-            <w:vAlign w:val="center"/>
-          </w:tcPr>
-          <w:p>
-            <w:r>
-              <w:rPr>
-                <w:rFonts w:ascii="Arial" w:cs="Arial" w:eastAsia="Arial" w:hAnsi="Arial"/>
-                <w:color w:val="2E7D32"/>
-                <w:sz w:val="20"/>
-                <w:szCs w:val="20"/>
-              </w:rPr>
-              <w:t xml:space="preserve">✓</w:t>
-            </w:r>
-          </w:p>
-        </w:tc>
-        <w:tc>
-          <w:tcPr>
-            <w:tcW w:type="dxa" w:w="1200"/>
-            <w:tcBorders>
-              <w:top w:val="single" w:color="CCCCCC" w:sz="1"/>
-              <w:left w:val="single" w:color="CCCCCC" w:sz="1"/>
-              <w:bottom w:val="single" w:color="CCCCCC" w:sz="1"/>
-              <w:right w:val="single" w:color="CCCCCC" w:sz="1"/>
-            </w:tcBorders>
-            <w:shd w:fill="F5F9FC" w:val="clear"/>
-            <w:tcMar>
-              <w:top w:type="dxa" w:w="80"/>
-              <w:left w:type="dxa" w:w="120"/>
-              <w:bottom w:type="dxa" w:w="80"/>
-              <w:right w:type="dxa" w:w="120"/>
-            </w:tcMar>
-            <w:vAlign w:val="center"/>
-          </w:tcPr>
-          <w:p>
-            <w:r>
-              <w:rPr>
-                <w:rFonts w:ascii="Arial" w:cs="Arial" w:eastAsia="Arial" w:hAnsi="Arial"/>
-                <w:color w:val="BDBDBD"/>
-                <w:sz w:val="20"/>
-                <w:szCs w:val="20"/>
-              </w:rPr>
-              <w:t xml:space="preserve">–</w:t>
-            </w:r>
-          </w:p>
-        </w:tc>
-        <w:tc>
-          <w:tcPr>
-            <w:tcW w:type="dxa" w:w="1160"/>
+            <w:tcW w:type="dxa" w:w="1260"/>
             <w:tcBorders>
               <w:top w:val="single" w:color="CCCCCC" w:sz="1"/>
               <w:left w:val="single" w:color="CCCCCC" w:sz="1"/>
@@ -3255,7 +2922,7 @@
       <w:tr>
         <w:tc>
           <w:tcPr>
-            <w:tcW w:type="dxa" w:w="2200"/>
+            <w:tcW w:type="dxa" w:w="2400"/>
             <w:tcBorders>
               <w:top w:val="single" w:color="CCCCCC" w:sz="1"/>
               <w:left w:val="single" w:color="CCCCCC" w:sz="1"/>
@@ -3286,7 +2953,7 @@
         </w:tc>
         <w:tc>
           <w:tcPr>
-            <w:tcW w:type="dxa" w:w="1200"/>
+            <w:tcW w:type="dxa" w:w="1500"/>
             <w:tcBorders>
               <w:top w:val="single" w:color="CCCCCC" w:sz="1"/>
               <w:left w:val="single" w:color="CCCCCC" w:sz="1"/>
@@ -3315,7 +2982,7 @@
         </w:tc>
         <w:tc>
           <w:tcPr>
-            <w:tcW w:type="dxa" w:w="1200"/>
+            <w:tcW w:type="dxa" w:w="1400"/>
             <w:tcBorders>
               <w:top w:val="single" w:color="CCCCCC" w:sz="1"/>
               <w:left w:val="single" w:color="CCCCCC" w:sz="1"/>
@@ -3344,7 +3011,7 @@
         </w:tc>
         <w:tc>
           <w:tcPr>
-            <w:tcW w:type="dxa" w:w="1200"/>
+            <w:tcW w:type="dxa" w:w="1400"/>
             <w:tcBorders>
               <w:top w:val="single" w:color="CCCCCC" w:sz="1"/>
               <w:left w:val="single" w:color="CCCCCC" w:sz="1"/>
@@ -3373,36 +3040,7 @@
         </w:tc>
         <w:tc>
           <w:tcPr>
-            <w:tcW w:type="dxa" w:w="1200"/>
-            <w:tcBorders>
-              <w:top w:val="single" w:color="CCCCCC" w:sz="1"/>
-              <w:left w:val="single" w:color="CCCCCC" w:sz="1"/>
-              <w:bottom w:val="single" w:color="CCCCCC" w:sz="1"/>
-              <w:right w:val="single" w:color="CCCCCC" w:sz="1"/>
-            </w:tcBorders>
-            <w:tcMar>
-              <w:top w:type="dxa" w:w="80"/>
-              <w:left w:type="dxa" w:w="120"/>
-              <w:bottom w:type="dxa" w:w="80"/>
-              <w:right w:type="dxa" w:w="120"/>
-            </w:tcMar>
-            <w:vAlign w:val="center"/>
-          </w:tcPr>
-          <w:p>
-            <w:r>
-              <w:rPr>
-                <w:rFonts w:ascii="Arial" w:cs="Arial" w:eastAsia="Arial" w:hAnsi="Arial"/>
-                <w:color w:val="2E7D32"/>
-                <w:sz w:val="20"/>
-                <w:szCs w:val="20"/>
-              </w:rPr>
-              <w:t xml:space="preserve">✓</w:t>
-            </w:r>
-          </w:p>
-        </w:tc>
-        <w:tc>
-          <w:tcPr>
-            <w:tcW w:type="dxa" w:w="1200"/>
+            <w:tcW w:type="dxa" w:w="1400"/>
             <w:tcBorders>
               <w:top w:val="single" w:color="CCCCCC" w:sz="1"/>
               <w:left w:val="single" w:color="CCCCCC" w:sz="1"/>
@@ -3431,32 +3069,32 @@
         </w:tc>
         <w:tc>
           <w:tcPr>
-            <w:tcW w:type="dxa" w:w="1160"/>
-            <w:tcBorders>
-              <w:top w:val="single" w:color="CCCCCC" w:sz="1"/>
-              <w:left w:val="single" w:color="CCCCCC" w:sz="1"/>
-              <w:bottom w:val="single" w:color="CCCCCC" w:sz="1"/>
-              <w:right w:val="single" w:color="CCCCCC" w:sz="1"/>
-            </w:tcBorders>
-            <w:tcMar>
-              <w:top w:type="dxa" w:w="80"/>
-              <w:left w:type="dxa" w:w="120"/>
-              <w:bottom w:type="dxa" w:w="80"/>
-              <w:right w:type="dxa" w:w="120"/>
-            </w:tcMar>
-            <w:vAlign w:val="center"/>
-          </w:tcPr>
-          <w:p>
-            <w:r>
-              <w:rPr>
-                <w:rFonts w:ascii="Arial" w:cs="Arial" w:eastAsia="Arial" w:hAnsi="Arial"/>
-                <w:b/>
-                <w:bCs/>
-                <w:color w:val="333333"/>
-                <w:sz w:val="20"/>
-                <w:szCs w:val="20"/>
-              </w:rPr>
-              <w:t xml:space="preserve">4</w:t>
+            <w:tcW w:type="dxa" w:w="1260"/>
+            <w:tcBorders>
+              <w:top w:val="single" w:color="CCCCCC" w:sz="1"/>
+              <w:left w:val="single" w:color="CCCCCC" w:sz="1"/>
+              <w:bottom w:val="single" w:color="CCCCCC" w:sz="1"/>
+              <w:right w:val="single" w:color="CCCCCC" w:sz="1"/>
+            </w:tcBorders>
+            <w:tcMar>
+              <w:top w:type="dxa" w:w="80"/>
+              <w:left w:type="dxa" w:w="120"/>
+              <w:bottom w:type="dxa" w:w="80"/>
+              <w:right w:type="dxa" w:w="120"/>
+            </w:tcMar>
+            <w:vAlign w:val="center"/>
+          </w:tcPr>
+          <w:p>
+            <w:r>
+              <w:rPr>
+                <w:rFonts w:ascii="Arial" w:cs="Arial" w:eastAsia="Arial" w:hAnsi="Arial"/>
+                <w:b/>
+                <w:bCs/>
+                <w:color w:val="333333"/>
+                <w:sz w:val="20"/>
+                <w:szCs w:val="20"/>
+              </w:rPr>
+              <w:t xml:space="preserve">3</w:t>
             </w:r>
           </w:p>
         </w:tc>
@@ -3464,7 +3102,7 @@
       <w:tr>
         <w:tc>
           <w:tcPr>
-            <w:tcW w:type="dxa" w:w="2200"/>
+            <w:tcW w:type="dxa" w:w="2400"/>
             <w:tcBorders>
               <w:top w:val="single" w:color="CCCCCC" w:sz="1"/>
               <w:left w:val="single" w:color="CCCCCC" w:sz="1"/>
@@ -3496,7 +3134,7 @@
         </w:tc>
         <w:tc>
           <w:tcPr>
-            <w:tcW w:type="dxa" w:w="1200"/>
+            <w:tcW w:type="dxa" w:w="1500"/>
             <w:tcBorders>
               <w:top w:val="single" w:color="CCCCCC" w:sz="1"/>
               <w:left w:val="single" w:color="CCCCCC" w:sz="1"/>
@@ -3526,37 +3164,7 @@
         </w:tc>
         <w:tc>
           <w:tcPr>
-            <w:tcW w:type="dxa" w:w="1200"/>
-            <w:tcBorders>
-              <w:top w:val="single" w:color="CCCCCC" w:sz="1"/>
-              <w:left w:val="single" w:color="CCCCCC" w:sz="1"/>
-              <w:bottom w:val="single" w:color="CCCCCC" w:sz="1"/>
-              <w:right w:val="single" w:color="CCCCCC" w:sz="1"/>
-            </w:tcBorders>
-            <w:shd w:fill="F5F9FC" w:val="clear"/>
-            <w:tcMar>
-              <w:top w:type="dxa" w:w="80"/>
-              <w:left w:type="dxa" w:w="120"/>
-              <w:bottom w:type="dxa" w:w="80"/>
-              <w:right w:type="dxa" w:w="120"/>
-            </w:tcMar>
-            <w:vAlign w:val="center"/>
-          </w:tcPr>
-          <w:p>
-            <w:r>
-              <w:rPr>
-                <w:rFonts w:ascii="Arial" w:cs="Arial" w:eastAsia="Arial" w:hAnsi="Arial"/>
-                <w:color w:val="2E7D32"/>
-                <w:sz w:val="20"/>
-                <w:szCs w:val="20"/>
-              </w:rPr>
-              <w:t xml:space="preserve">✓</w:t>
-            </w:r>
-          </w:p>
-        </w:tc>
-        <w:tc>
-          <w:tcPr>
-            <w:tcW w:type="dxa" w:w="1200"/>
+            <w:tcW w:type="dxa" w:w="1400"/>
             <w:tcBorders>
               <w:top w:val="single" w:color="CCCCCC" w:sz="1"/>
               <w:left w:val="single" w:color="CCCCCC" w:sz="1"/>
@@ -3586,7 +3194,7 @@
         </w:tc>
         <w:tc>
           <w:tcPr>
-            <w:tcW w:type="dxa" w:w="1200"/>
+            <w:tcW w:type="dxa" w:w="1400"/>
             <w:tcBorders>
               <w:top w:val="single" w:color="CCCCCC" w:sz="1"/>
               <w:left w:val="single" w:color="CCCCCC" w:sz="1"/>
@@ -3616,7 +3224,7 @@
         </w:tc>
         <w:tc>
           <w:tcPr>
-            <w:tcW w:type="dxa" w:w="1200"/>
+            <w:tcW w:type="dxa" w:w="1400"/>
             <w:tcBorders>
               <w:top w:val="single" w:color="CCCCCC" w:sz="1"/>
               <w:left w:val="single" w:color="CCCCCC" w:sz="1"/>
@@ -3646,33 +3254,33 @@
         </w:tc>
         <w:tc>
           <w:tcPr>
-            <w:tcW w:type="dxa" w:w="1160"/>
-            <w:tcBorders>
-              <w:top w:val="single" w:color="CCCCCC" w:sz="1"/>
-              <w:left w:val="single" w:color="CCCCCC" w:sz="1"/>
-              <w:bottom w:val="single" w:color="CCCCCC" w:sz="1"/>
-              <w:right w:val="single" w:color="CCCCCC" w:sz="1"/>
-            </w:tcBorders>
-            <w:shd w:fill="F5F9FC" w:val="clear"/>
-            <w:tcMar>
-              <w:top w:type="dxa" w:w="80"/>
-              <w:left w:type="dxa" w:w="120"/>
-              <w:bottom w:type="dxa" w:w="80"/>
-              <w:right w:type="dxa" w:w="120"/>
-            </w:tcMar>
-            <w:vAlign w:val="center"/>
-          </w:tcPr>
-          <w:p>
-            <w:r>
-              <w:rPr>
-                <w:rFonts w:ascii="Arial" w:cs="Arial" w:eastAsia="Arial" w:hAnsi="Arial"/>
-                <w:b/>
-                <w:bCs/>
-                <w:color w:val="333333"/>
-                <w:sz w:val="20"/>
-                <w:szCs w:val="20"/>
-              </w:rPr>
-              <w:t xml:space="preserve">2</w:t>
+            <w:tcW w:type="dxa" w:w="1260"/>
+            <w:tcBorders>
+              <w:top w:val="single" w:color="CCCCCC" w:sz="1"/>
+              <w:left w:val="single" w:color="CCCCCC" w:sz="1"/>
+              <w:bottom w:val="single" w:color="CCCCCC" w:sz="1"/>
+              <w:right w:val="single" w:color="CCCCCC" w:sz="1"/>
+            </w:tcBorders>
+            <w:shd w:fill="F5F9FC" w:val="clear"/>
+            <w:tcMar>
+              <w:top w:type="dxa" w:w="80"/>
+              <w:left w:type="dxa" w:w="120"/>
+              <w:bottom w:type="dxa" w:w="80"/>
+              <w:right w:type="dxa" w:w="120"/>
+            </w:tcMar>
+            <w:vAlign w:val="center"/>
+          </w:tcPr>
+          <w:p>
+            <w:r>
+              <w:rPr>
+                <w:rFonts w:ascii="Arial" w:cs="Arial" w:eastAsia="Arial" w:hAnsi="Arial"/>
+                <w:b/>
+                <w:bCs/>
+                <w:color w:val="333333"/>
+                <w:sz w:val="20"/>
+                <w:szCs w:val="20"/>
+              </w:rPr>
+              <w:t xml:space="preserve">1</w:t>
             </w:r>
           </w:p>
         </w:tc>
@@ -3680,7 +3288,7 @@
       <w:tr>
         <w:tc>
           <w:tcPr>
-            <w:tcW w:type="dxa" w:w="2200"/>
+            <w:tcW w:type="dxa" w:w="2400"/>
             <w:tcBorders>
               <w:top w:val="single" w:color="CCCCCC" w:sz="1"/>
               <w:left w:val="single" w:color="CCCCCC" w:sz="1"/>
@@ -3711,7 +3319,7 @@
         </w:tc>
         <w:tc>
           <w:tcPr>
-            <w:tcW w:type="dxa" w:w="1200"/>
+            <w:tcW w:type="dxa" w:w="1500"/>
             <w:tcBorders>
               <w:top w:val="single" w:color="CCCCCC" w:sz="1"/>
               <w:left w:val="single" w:color="CCCCCC" w:sz="1"/>
@@ -3740,7 +3348,7 @@
         </w:tc>
         <w:tc>
           <w:tcPr>
-            <w:tcW w:type="dxa" w:w="1200"/>
+            <w:tcW w:type="dxa" w:w="1400"/>
             <w:tcBorders>
               <w:top w:val="single" w:color="CCCCCC" w:sz="1"/>
               <w:left w:val="single" w:color="CCCCCC" w:sz="1"/>
@@ -3769,7 +3377,7 @@
         </w:tc>
         <w:tc>
           <w:tcPr>
-            <w:tcW w:type="dxa" w:w="1200"/>
+            <w:tcW w:type="dxa" w:w="1400"/>
             <w:tcBorders>
               <w:top w:val="single" w:color="CCCCCC" w:sz="1"/>
               <w:left w:val="single" w:color="CCCCCC" w:sz="1"/>
@@ -3798,36 +3406,7 @@
         </w:tc>
         <w:tc>
           <w:tcPr>
-            <w:tcW w:type="dxa" w:w="1200"/>
-            <w:tcBorders>
-              <w:top w:val="single" w:color="CCCCCC" w:sz="1"/>
-              <w:left w:val="single" w:color="CCCCCC" w:sz="1"/>
-              <w:bottom w:val="single" w:color="CCCCCC" w:sz="1"/>
-              <w:right w:val="single" w:color="CCCCCC" w:sz="1"/>
-            </w:tcBorders>
-            <w:tcMar>
-              <w:top w:type="dxa" w:w="80"/>
-              <w:left w:type="dxa" w:w="120"/>
-              <w:bottom w:type="dxa" w:w="80"/>
-              <w:right w:type="dxa" w:w="120"/>
-            </w:tcMar>
-            <w:vAlign w:val="center"/>
-          </w:tcPr>
-          <w:p>
-            <w:r>
-              <w:rPr>
-                <w:rFonts w:ascii="Arial" w:cs="Arial" w:eastAsia="Arial" w:hAnsi="Arial"/>
-                <w:color w:val="2E7D32"/>
-                <w:sz w:val="20"/>
-                <w:szCs w:val="20"/>
-              </w:rPr>
-              <w:t xml:space="preserve">✓</w:t>
-            </w:r>
-          </w:p>
-        </w:tc>
-        <w:tc>
-          <w:tcPr>
-            <w:tcW w:type="dxa" w:w="1200"/>
+            <w:tcW w:type="dxa" w:w="1400"/>
             <w:tcBorders>
               <w:top w:val="single" w:color="CCCCCC" w:sz="1"/>
               <w:left w:val="single" w:color="CCCCCC" w:sz="1"/>
@@ -3856,32 +3435,32 @@
         </w:tc>
         <w:tc>
           <w:tcPr>
-            <w:tcW w:type="dxa" w:w="1160"/>
-            <w:tcBorders>
-              <w:top w:val="single" w:color="CCCCCC" w:sz="1"/>
-              <w:left w:val="single" w:color="CCCCCC" w:sz="1"/>
-              <w:bottom w:val="single" w:color="CCCCCC" w:sz="1"/>
-              <w:right w:val="single" w:color="CCCCCC" w:sz="1"/>
-            </w:tcBorders>
-            <w:tcMar>
-              <w:top w:type="dxa" w:w="80"/>
-              <w:left w:type="dxa" w:w="120"/>
-              <w:bottom w:type="dxa" w:w="80"/>
-              <w:right w:type="dxa" w:w="120"/>
-            </w:tcMar>
-            <w:vAlign w:val="center"/>
-          </w:tcPr>
-          <w:p>
-            <w:r>
-              <w:rPr>
-                <w:rFonts w:ascii="Arial" w:cs="Arial" w:eastAsia="Arial" w:hAnsi="Arial"/>
-                <w:b/>
-                <w:bCs/>
-                <w:color w:val="333333"/>
-                <w:sz w:val="20"/>
-                <w:szCs w:val="20"/>
-              </w:rPr>
-              <w:t xml:space="preserve">4</w:t>
+            <w:tcW w:type="dxa" w:w="1260"/>
+            <w:tcBorders>
+              <w:top w:val="single" w:color="CCCCCC" w:sz="1"/>
+              <w:left w:val="single" w:color="CCCCCC" w:sz="1"/>
+              <w:bottom w:val="single" w:color="CCCCCC" w:sz="1"/>
+              <w:right w:val="single" w:color="CCCCCC" w:sz="1"/>
+            </w:tcBorders>
+            <w:tcMar>
+              <w:top w:type="dxa" w:w="80"/>
+              <w:left w:type="dxa" w:w="120"/>
+              <w:bottom w:type="dxa" w:w="80"/>
+              <w:right w:type="dxa" w:w="120"/>
+            </w:tcMar>
+            <w:vAlign w:val="center"/>
+          </w:tcPr>
+          <w:p>
+            <w:r>
+              <w:rPr>
+                <w:rFonts w:ascii="Arial" w:cs="Arial" w:eastAsia="Arial" w:hAnsi="Arial"/>
+                <w:b/>
+                <w:bCs/>
+                <w:color w:val="333333"/>
+                <w:sz w:val="20"/>
+                <w:szCs w:val="20"/>
+              </w:rPr>
+              <w:t xml:space="preserve">3</w:t>
             </w:r>
           </w:p>
         </w:tc>
@@ -3889,7 +3468,7 @@
       <w:tr>
         <w:tc>
           <w:tcPr>
-            <w:tcW w:type="dxa" w:w="2200"/>
+            <w:tcW w:type="dxa" w:w="2400"/>
             <w:tcBorders>
               <w:top w:val="single" w:color="CCCCCC" w:sz="1"/>
               <w:left w:val="single" w:color="CCCCCC" w:sz="1"/>
@@ -3921,7 +3500,7 @@
         </w:tc>
         <w:tc>
           <w:tcPr>
-            <w:tcW w:type="dxa" w:w="1200"/>
+            <w:tcW w:type="dxa" w:w="1500"/>
             <w:tcBorders>
               <w:top w:val="single" w:color="CCCCCC" w:sz="1"/>
               <w:left w:val="single" w:color="CCCCCC" w:sz="1"/>
@@ -3951,7 +3530,7 @@
         </w:tc>
         <w:tc>
           <w:tcPr>
-            <w:tcW w:type="dxa" w:w="1200"/>
+            <w:tcW w:type="dxa" w:w="1400"/>
             <w:tcBorders>
               <w:top w:val="single" w:color="CCCCCC" w:sz="1"/>
               <w:left w:val="single" w:color="CCCCCC" w:sz="1"/>
@@ -3981,7 +3560,7 @@
         </w:tc>
         <w:tc>
           <w:tcPr>
-            <w:tcW w:type="dxa" w:w="1200"/>
+            <w:tcW w:type="dxa" w:w="1400"/>
             <w:tcBorders>
               <w:top w:val="single" w:color="CCCCCC" w:sz="1"/>
               <w:left w:val="single" w:color="CCCCCC" w:sz="1"/>
@@ -4011,37 +3590,7 @@
         </w:tc>
         <w:tc>
           <w:tcPr>
-            <w:tcW w:type="dxa" w:w="1200"/>
-            <w:tcBorders>
-              <w:top w:val="single" w:color="CCCCCC" w:sz="1"/>
-              <w:left w:val="single" w:color="CCCCCC" w:sz="1"/>
-              <w:bottom w:val="single" w:color="CCCCCC" w:sz="1"/>
-              <w:right w:val="single" w:color="CCCCCC" w:sz="1"/>
-            </w:tcBorders>
-            <w:shd w:fill="F5F9FC" w:val="clear"/>
-            <w:tcMar>
-              <w:top w:type="dxa" w:w="80"/>
-              <w:left w:type="dxa" w:w="120"/>
-              <w:bottom w:type="dxa" w:w="80"/>
-              <w:right w:type="dxa" w:w="120"/>
-            </w:tcMar>
-            <w:vAlign w:val="center"/>
-          </w:tcPr>
-          <w:p>
-            <w:r>
-              <w:rPr>
-                <w:rFonts w:ascii="Arial" w:cs="Arial" w:eastAsia="Arial" w:hAnsi="Arial"/>
-                <w:color w:val="2E7D32"/>
-                <w:sz w:val="20"/>
-                <w:szCs w:val="20"/>
-              </w:rPr>
-              <w:t xml:space="preserve">✓</w:t>
-            </w:r>
-          </w:p>
-        </w:tc>
-        <w:tc>
-          <w:tcPr>
-            <w:tcW w:type="dxa" w:w="1200"/>
+            <w:tcW w:type="dxa" w:w="1400"/>
             <w:tcBorders>
               <w:top w:val="single" w:color="CCCCCC" w:sz="1"/>
               <w:left w:val="single" w:color="CCCCCC" w:sz="1"/>
@@ -4071,33 +3620,33 @@
         </w:tc>
         <w:tc>
           <w:tcPr>
-            <w:tcW w:type="dxa" w:w="1160"/>
-            <w:tcBorders>
-              <w:top w:val="single" w:color="CCCCCC" w:sz="1"/>
-              <w:left w:val="single" w:color="CCCCCC" w:sz="1"/>
-              <w:bottom w:val="single" w:color="CCCCCC" w:sz="1"/>
-              <w:right w:val="single" w:color="CCCCCC" w:sz="1"/>
-            </w:tcBorders>
-            <w:shd w:fill="F5F9FC" w:val="clear"/>
-            <w:tcMar>
-              <w:top w:type="dxa" w:w="80"/>
-              <w:left w:type="dxa" w:w="120"/>
-              <w:bottom w:type="dxa" w:w="80"/>
-              <w:right w:type="dxa" w:w="120"/>
-            </w:tcMar>
-            <w:vAlign w:val="center"/>
-          </w:tcPr>
-          <w:p>
-            <w:r>
-              <w:rPr>
-                <w:rFonts w:ascii="Arial" w:cs="Arial" w:eastAsia="Arial" w:hAnsi="Arial"/>
-                <w:b/>
-                <w:bCs/>
-                <w:color w:val="333333"/>
-                <w:sz w:val="20"/>
-                <w:szCs w:val="20"/>
-              </w:rPr>
-              <w:t xml:space="preserve">4</w:t>
+            <w:tcW w:type="dxa" w:w="1260"/>
+            <w:tcBorders>
+              <w:top w:val="single" w:color="CCCCCC" w:sz="1"/>
+              <w:left w:val="single" w:color="CCCCCC" w:sz="1"/>
+              <w:bottom w:val="single" w:color="CCCCCC" w:sz="1"/>
+              <w:right w:val="single" w:color="CCCCCC" w:sz="1"/>
+            </w:tcBorders>
+            <w:shd w:fill="F5F9FC" w:val="clear"/>
+            <w:tcMar>
+              <w:top w:type="dxa" w:w="80"/>
+              <w:left w:type="dxa" w:w="120"/>
+              <w:bottom w:type="dxa" w:w="80"/>
+              <w:right w:type="dxa" w:w="120"/>
+            </w:tcMar>
+            <w:vAlign w:val="center"/>
+          </w:tcPr>
+          <w:p>
+            <w:r>
+              <w:rPr>
+                <w:rFonts w:ascii="Arial" w:cs="Arial" w:eastAsia="Arial" w:hAnsi="Arial"/>
+                <w:b/>
+                <w:bCs/>
+                <w:color w:val="333333"/>
+                <w:sz w:val="20"/>
+                <w:szCs w:val="20"/>
+              </w:rPr>
+              <w:t xml:space="preserve">3</w:t>
             </w:r>
           </w:p>
         </w:tc>
@@ -4105,7 +3654,7 @@
       <w:tr>
         <w:tc>
           <w:tcPr>
-            <w:tcW w:type="dxa" w:w="2200"/>
+            <w:tcW w:type="dxa" w:w="2400"/>
             <w:tcBorders>
               <w:top w:val="single" w:color="CCCCCC" w:sz="1"/>
               <w:left w:val="single" w:color="CCCCCC" w:sz="1"/>
@@ -4136,7 +3685,7 @@
         </w:tc>
         <w:tc>
           <w:tcPr>
-            <w:tcW w:type="dxa" w:w="1200"/>
+            <w:tcW w:type="dxa" w:w="1500"/>
             <w:tcBorders>
               <w:top w:val="single" w:color="CCCCCC" w:sz="1"/>
               <w:left w:val="single" w:color="CCCCCC" w:sz="1"/>
@@ -4165,7 +3714,7 @@
         </w:tc>
         <w:tc>
           <w:tcPr>
-            <w:tcW w:type="dxa" w:w="1200"/>
+            <w:tcW w:type="dxa" w:w="1400"/>
             <w:tcBorders>
               <w:top w:val="single" w:color="CCCCCC" w:sz="1"/>
               <w:left w:val="single" w:color="CCCCCC" w:sz="1"/>
@@ -4194,7 +3743,7 @@
         </w:tc>
         <w:tc>
           <w:tcPr>
-            <w:tcW w:type="dxa" w:w="1200"/>
+            <w:tcW w:type="dxa" w:w="1400"/>
             <w:tcBorders>
               <w:top w:val="single" w:color="CCCCCC" w:sz="1"/>
               <w:left w:val="single" w:color="CCCCCC" w:sz="1"/>
@@ -4223,7 +3772,7 @@
         </w:tc>
         <w:tc>
           <w:tcPr>
-            <w:tcW w:type="dxa" w:w="1200"/>
+            <w:tcW w:type="dxa" w:w="1400"/>
             <w:tcBorders>
               <w:top w:val="single" w:color="CCCCCC" w:sz="1"/>
               <w:left w:val="single" w:color="CCCCCC" w:sz="1"/>
@@ -4252,61 +3801,32 @@
         </w:tc>
         <w:tc>
           <w:tcPr>
-            <w:tcW w:type="dxa" w:w="1200"/>
-            <w:tcBorders>
-              <w:top w:val="single" w:color="CCCCCC" w:sz="1"/>
-              <w:left w:val="single" w:color="CCCCCC" w:sz="1"/>
-              <w:bottom w:val="single" w:color="CCCCCC" w:sz="1"/>
-              <w:right w:val="single" w:color="CCCCCC" w:sz="1"/>
-            </w:tcBorders>
-            <w:tcMar>
-              <w:top w:type="dxa" w:w="80"/>
-              <w:left w:type="dxa" w:w="120"/>
-              <w:bottom w:type="dxa" w:w="80"/>
-              <w:right w:type="dxa" w:w="120"/>
-            </w:tcMar>
-            <w:vAlign w:val="center"/>
-          </w:tcPr>
-          <w:p>
-            <w:r>
-              <w:rPr>
-                <w:rFonts w:ascii="Arial" w:cs="Arial" w:eastAsia="Arial" w:hAnsi="Arial"/>
-                <w:color w:val="2E7D32"/>
-                <w:sz w:val="20"/>
-                <w:szCs w:val="20"/>
-              </w:rPr>
-              <w:t xml:space="preserve">✓</w:t>
-            </w:r>
-          </w:p>
-        </w:tc>
-        <w:tc>
-          <w:tcPr>
-            <w:tcW w:type="dxa" w:w="1160"/>
-            <w:tcBorders>
-              <w:top w:val="single" w:color="CCCCCC" w:sz="1"/>
-              <w:left w:val="single" w:color="CCCCCC" w:sz="1"/>
-              <w:bottom w:val="single" w:color="CCCCCC" w:sz="1"/>
-              <w:right w:val="single" w:color="CCCCCC" w:sz="1"/>
-            </w:tcBorders>
-            <w:tcMar>
-              <w:top w:type="dxa" w:w="80"/>
-              <w:left w:type="dxa" w:w="120"/>
-              <w:bottom w:type="dxa" w:w="80"/>
-              <w:right w:type="dxa" w:w="120"/>
-            </w:tcMar>
-            <w:vAlign w:val="center"/>
-          </w:tcPr>
-          <w:p>
-            <w:r>
-              <w:rPr>
-                <w:rFonts w:ascii="Arial" w:cs="Arial" w:eastAsia="Arial" w:hAnsi="Arial"/>
-                <w:b/>
-                <w:bCs/>
-                <w:color w:val="333333"/>
-                <w:sz w:val="20"/>
-                <w:szCs w:val="20"/>
-              </w:rPr>
-              <w:t xml:space="preserve">5</w:t>
+            <w:tcW w:type="dxa" w:w="1260"/>
+            <w:tcBorders>
+              <w:top w:val="single" w:color="CCCCCC" w:sz="1"/>
+              <w:left w:val="single" w:color="CCCCCC" w:sz="1"/>
+              <w:bottom w:val="single" w:color="CCCCCC" w:sz="1"/>
+              <w:right w:val="single" w:color="CCCCCC" w:sz="1"/>
+            </w:tcBorders>
+            <w:tcMar>
+              <w:top w:type="dxa" w:w="80"/>
+              <w:left w:type="dxa" w:w="120"/>
+              <w:bottom w:type="dxa" w:w="80"/>
+              <w:right w:type="dxa" w:w="120"/>
+            </w:tcMar>
+            <w:vAlign w:val="center"/>
+          </w:tcPr>
+          <w:p>
+            <w:r>
+              <w:rPr>
+                <w:rFonts w:ascii="Arial" w:cs="Arial" w:eastAsia="Arial" w:hAnsi="Arial"/>
+                <w:b/>
+                <w:bCs/>
+                <w:color w:val="333333"/>
+                <w:sz w:val="20"/>
+                <w:szCs w:val="20"/>
+              </w:rPr>
+              <w:t xml:space="preserve">4</w:t>
             </w:r>
           </w:p>
         </w:tc>
@@ -4314,7 +3834,7 @@
       <w:tr>
         <w:tc>
           <w:tcPr>
-            <w:tcW w:type="dxa" w:w="2200"/>
+            <w:tcW w:type="dxa" w:w="2400"/>
             <w:tcBorders>
               <w:top w:val="single" w:color="CCCCCC" w:sz="1"/>
               <w:left w:val="single" w:color="CCCCCC" w:sz="1"/>
@@ -4346,7 +3866,7 @@
         </w:tc>
         <w:tc>
           <w:tcPr>
-            <w:tcW w:type="dxa" w:w="1200"/>
+            <w:tcW w:type="dxa" w:w="1500"/>
             <w:tcBorders>
               <w:top w:val="single" w:color="CCCCCC" w:sz="1"/>
               <w:left w:val="single" w:color="CCCCCC" w:sz="1"/>
@@ -4376,7 +3896,7 @@
         </w:tc>
         <w:tc>
           <w:tcPr>
-            <w:tcW w:type="dxa" w:w="1200"/>
+            <w:tcW w:type="dxa" w:w="1400"/>
             <w:tcBorders>
               <w:top w:val="single" w:color="CCCCCC" w:sz="1"/>
               <w:left w:val="single" w:color="CCCCCC" w:sz="1"/>
@@ -4406,7 +3926,7 @@
         </w:tc>
         <w:tc>
           <w:tcPr>
-            <w:tcW w:type="dxa" w:w="1200"/>
+            <w:tcW w:type="dxa" w:w="1400"/>
             <w:tcBorders>
               <w:top w:val="single" w:color="CCCCCC" w:sz="1"/>
               <w:left w:val="single" w:color="CCCCCC" w:sz="1"/>
@@ -4436,7 +3956,7 @@
         </w:tc>
         <w:tc>
           <w:tcPr>
-            <w:tcW w:type="dxa" w:w="1200"/>
+            <w:tcW w:type="dxa" w:w="1400"/>
             <w:tcBorders>
               <w:top w:val="single" w:color="CCCCCC" w:sz="1"/>
               <w:left w:val="single" w:color="CCCCCC" w:sz="1"/>
@@ -4466,63 +3986,33 @@
         </w:tc>
         <w:tc>
           <w:tcPr>
-            <w:tcW w:type="dxa" w:w="1200"/>
-            <w:tcBorders>
-              <w:top w:val="single" w:color="CCCCCC" w:sz="1"/>
-              <w:left w:val="single" w:color="CCCCCC" w:sz="1"/>
-              <w:bottom w:val="single" w:color="CCCCCC" w:sz="1"/>
-              <w:right w:val="single" w:color="CCCCCC" w:sz="1"/>
-            </w:tcBorders>
-            <w:shd w:fill="F5F9FC" w:val="clear"/>
-            <w:tcMar>
-              <w:top w:type="dxa" w:w="80"/>
-              <w:left w:type="dxa" w:w="120"/>
-              <w:bottom w:type="dxa" w:w="80"/>
-              <w:right w:type="dxa" w:w="120"/>
-            </w:tcMar>
-            <w:vAlign w:val="center"/>
-          </w:tcPr>
-          <w:p>
-            <w:r>
-              <w:rPr>
-                <w:rFonts w:ascii="Arial" w:cs="Arial" w:eastAsia="Arial" w:hAnsi="Arial"/>
-                <w:color w:val="2E7D32"/>
-                <w:sz w:val="20"/>
-                <w:szCs w:val="20"/>
-              </w:rPr>
-              <w:t xml:space="preserve">✓</w:t>
-            </w:r>
-          </w:p>
-        </w:tc>
-        <w:tc>
-          <w:tcPr>
-            <w:tcW w:type="dxa" w:w="1160"/>
-            <w:tcBorders>
-              <w:top w:val="single" w:color="CCCCCC" w:sz="1"/>
-              <w:left w:val="single" w:color="CCCCCC" w:sz="1"/>
-              <w:bottom w:val="single" w:color="CCCCCC" w:sz="1"/>
-              <w:right w:val="single" w:color="CCCCCC" w:sz="1"/>
-            </w:tcBorders>
-            <w:shd w:fill="F5F9FC" w:val="clear"/>
-            <w:tcMar>
-              <w:top w:type="dxa" w:w="80"/>
-              <w:left w:type="dxa" w:w="120"/>
-              <w:bottom w:type="dxa" w:w="80"/>
-              <w:right w:type="dxa" w:w="120"/>
-            </w:tcMar>
-            <w:vAlign w:val="center"/>
-          </w:tcPr>
-          <w:p>
-            <w:r>
-              <w:rPr>
-                <w:rFonts w:ascii="Arial" w:cs="Arial" w:eastAsia="Arial" w:hAnsi="Arial"/>
-                <w:b/>
-                <w:bCs/>
-                <w:color w:val="333333"/>
-                <w:sz w:val="20"/>
-                <w:szCs w:val="20"/>
-              </w:rPr>
-              <w:t xml:space="preserve">5</w:t>
+            <w:tcW w:type="dxa" w:w="1260"/>
+            <w:tcBorders>
+              <w:top w:val="single" w:color="CCCCCC" w:sz="1"/>
+              <w:left w:val="single" w:color="CCCCCC" w:sz="1"/>
+              <w:bottom w:val="single" w:color="CCCCCC" w:sz="1"/>
+              <w:right w:val="single" w:color="CCCCCC" w:sz="1"/>
+            </w:tcBorders>
+            <w:shd w:fill="F5F9FC" w:val="clear"/>
+            <w:tcMar>
+              <w:top w:type="dxa" w:w="80"/>
+              <w:left w:type="dxa" w:w="120"/>
+              <w:bottom w:type="dxa" w:w="80"/>
+              <w:right w:type="dxa" w:w="120"/>
+            </w:tcMar>
+            <w:vAlign w:val="center"/>
+          </w:tcPr>
+          <w:p>
+            <w:r>
+              <w:rPr>
+                <w:rFonts w:ascii="Arial" w:cs="Arial" w:eastAsia="Arial" w:hAnsi="Arial"/>
+                <w:b/>
+                <w:bCs/>
+                <w:color w:val="333333"/>
+                <w:sz w:val="20"/>
+                <w:szCs w:val="20"/>
+              </w:rPr>
+              <w:t xml:space="preserve">4</w:t>
             </w:r>
           </w:p>
         </w:tc>
@@ -4530,7 +4020,7 @@
       <w:tr>
         <w:tc>
           <w:tcPr>
-            <w:tcW w:type="dxa" w:w="2200"/>
+            <w:tcW w:type="dxa" w:w="2400"/>
             <w:tcBorders>
               <w:top w:val="single" w:color="CCCCCC" w:sz="1"/>
               <w:left w:val="single" w:color="CCCCCC" w:sz="1"/>
@@ -4561,7 +4051,7 @@
         </w:tc>
         <w:tc>
           <w:tcPr>
-            <w:tcW w:type="dxa" w:w="1200"/>
+            <w:tcW w:type="dxa" w:w="1500"/>
             <w:tcBorders>
               <w:top w:val="single" w:color="CCCCCC" w:sz="1"/>
               <w:left w:val="single" w:color="CCCCCC" w:sz="1"/>
@@ -4590,7 +4080,7 @@
         </w:tc>
         <w:tc>
           <w:tcPr>
-            <w:tcW w:type="dxa" w:w="1200"/>
+            <w:tcW w:type="dxa" w:w="1400"/>
             <w:tcBorders>
               <w:top w:val="single" w:color="CCCCCC" w:sz="1"/>
               <w:left w:val="single" w:color="CCCCCC" w:sz="1"/>
@@ -4619,7 +4109,7 @@
         </w:tc>
         <w:tc>
           <w:tcPr>
-            <w:tcW w:type="dxa" w:w="1200"/>
+            <w:tcW w:type="dxa" w:w="1400"/>
             <w:tcBorders>
               <w:top w:val="single" w:color="CCCCCC" w:sz="1"/>
               <w:left w:val="single" w:color="CCCCCC" w:sz="1"/>
@@ -4648,36 +4138,7 @@
         </w:tc>
         <w:tc>
           <w:tcPr>
-            <w:tcW w:type="dxa" w:w="1200"/>
-            <w:tcBorders>
-              <w:top w:val="single" w:color="CCCCCC" w:sz="1"/>
-              <w:left w:val="single" w:color="CCCCCC" w:sz="1"/>
-              <w:bottom w:val="single" w:color="CCCCCC" w:sz="1"/>
-              <w:right w:val="single" w:color="CCCCCC" w:sz="1"/>
-            </w:tcBorders>
-            <w:tcMar>
-              <w:top w:type="dxa" w:w="80"/>
-              <w:left w:type="dxa" w:w="120"/>
-              <w:bottom w:type="dxa" w:w="80"/>
-              <w:right w:type="dxa" w:w="120"/>
-            </w:tcMar>
-            <w:vAlign w:val="center"/>
-          </w:tcPr>
-          <w:p>
-            <w:r>
-              <w:rPr>
-                <w:rFonts w:ascii="Arial" w:cs="Arial" w:eastAsia="Arial" w:hAnsi="Arial"/>
-                <w:color w:val="2E7D32"/>
-                <w:sz w:val="20"/>
-                <w:szCs w:val="20"/>
-              </w:rPr>
-              <w:t xml:space="preserve">✓</w:t>
-            </w:r>
-          </w:p>
-        </w:tc>
-        <w:tc>
-          <w:tcPr>
-            <w:tcW w:type="dxa" w:w="1200"/>
+            <w:tcW w:type="dxa" w:w="1400"/>
             <w:tcBorders>
               <w:top w:val="single" w:color="CCCCCC" w:sz="1"/>
               <w:left w:val="single" w:color="CCCCCC" w:sz="1"/>
@@ -4706,32 +4167,32 @@
         </w:tc>
         <w:tc>
           <w:tcPr>
-            <w:tcW w:type="dxa" w:w="1160"/>
-            <w:tcBorders>
-              <w:top w:val="single" w:color="CCCCCC" w:sz="1"/>
-              <w:left w:val="single" w:color="CCCCCC" w:sz="1"/>
-              <w:bottom w:val="single" w:color="CCCCCC" w:sz="1"/>
-              <w:right w:val="single" w:color="CCCCCC" w:sz="1"/>
-            </w:tcBorders>
-            <w:tcMar>
-              <w:top w:type="dxa" w:w="80"/>
-              <w:left w:type="dxa" w:w="120"/>
-              <w:bottom w:type="dxa" w:w="80"/>
-              <w:right w:type="dxa" w:w="120"/>
-            </w:tcMar>
-            <w:vAlign w:val="center"/>
-          </w:tcPr>
-          <w:p>
-            <w:r>
-              <w:rPr>
-                <w:rFonts w:ascii="Arial" w:cs="Arial" w:eastAsia="Arial" w:hAnsi="Arial"/>
-                <w:b/>
-                <w:bCs/>
-                <w:color w:val="333333"/>
-                <w:sz w:val="20"/>
-                <w:szCs w:val="20"/>
-              </w:rPr>
-              <w:t xml:space="preserve">4</w:t>
+            <w:tcW w:type="dxa" w:w="1260"/>
+            <w:tcBorders>
+              <w:top w:val="single" w:color="CCCCCC" w:sz="1"/>
+              <w:left w:val="single" w:color="CCCCCC" w:sz="1"/>
+              <w:bottom w:val="single" w:color="CCCCCC" w:sz="1"/>
+              <w:right w:val="single" w:color="CCCCCC" w:sz="1"/>
+            </w:tcBorders>
+            <w:tcMar>
+              <w:top w:type="dxa" w:w="80"/>
+              <w:left w:type="dxa" w:w="120"/>
+              <w:bottom w:type="dxa" w:w="80"/>
+              <w:right w:type="dxa" w:w="120"/>
+            </w:tcMar>
+            <w:vAlign w:val="center"/>
+          </w:tcPr>
+          <w:p>
+            <w:r>
+              <w:rPr>
+                <w:rFonts w:ascii="Arial" w:cs="Arial" w:eastAsia="Arial" w:hAnsi="Arial"/>
+                <w:b/>
+                <w:bCs/>
+                <w:color w:val="333333"/>
+                <w:sz w:val="20"/>
+                <w:szCs w:val="20"/>
+              </w:rPr>
+              <w:t xml:space="preserve">3</w:t>
             </w:r>
           </w:p>
         </w:tc>
@@ -4739,7 +4200,7 @@
       <w:tr>
         <w:tc>
           <w:tcPr>
-            <w:tcW w:type="dxa" w:w="2200"/>
+            <w:tcW w:type="dxa" w:w="2400"/>
             <w:tcBorders>
               <w:top w:val="single" w:color="CCCCCC" w:sz="1"/>
               <w:left w:val="single" w:color="CCCCCC" w:sz="1"/>
@@ -4771,7 +4232,7 @@
         </w:tc>
         <w:tc>
           <w:tcPr>
-            <w:tcW w:type="dxa" w:w="1200"/>
+            <w:tcW w:type="dxa" w:w="1500"/>
             <w:tcBorders>
               <w:top w:val="single" w:color="CCCCCC" w:sz="1"/>
               <w:left w:val="single" w:color="CCCCCC" w:sz="1"/>
@@ -4801,7 +4262,7 @@
         </w:tc>
         <w:tc>
           <w:tcPr>
-            <w:tcW w:type="dxa" w:w="1200"/>
+            <w:tcW w:type="dxa" w:w="1400"/>
             <w:tcBorders>
               <w:top w:val="single" w:color="CCCCCC" w:sz="1"/>
               <w:left w:val="single" w:color="CCCCCC" w:sz="1"/>
@@ -4831,7 +4292,7 @@
         </w:tc>
         <w:tc>
           <w:tcPr>
-            <w:tcW w:type="dxa" w:w="1200"/>
+            <w:tcW w:type="dxa" w:w="1400"/>
             <w:tcBorders>
               <w:top w:val="single" w:color="CCCCCC" w:sz="1"/>
               <w:left w:val="single" w:color="CCCCCC" w:sz="1"/>
@@ -4861,37 +4322,7 @@
         </w:tc>
         <w:tc>
           <w:tcPr>
-            <w:tcW w:type="dxa" w:w="1200"/>
-            <w:tcBorders>
-              <w:top w:val="single" w:color="CCCCCC" w:sz="1"/>
-              <w:left w:val="single" w:color="CCCCCC" w:sz="1"/>
-              <w:bottom w:val="single" w:color="CCCCCC" w:sz="1"/>
-              <w:right w:val="single" w:color="CCCCCC" w:sz="1"/>
-            </w:tcBorders>
-            <w:shd w:fill="F5F9FC" w:val="clear"/>
-            <w:tcMar>
-              <w:top w:type="dxa" w:w="80"/>
-              <w:left w:type="dxa" w:w="120"/>
-              <w:bottom w:type="dxa" w:w="80"/>
-              <w:right w:type="dxa" w:w="120"/>
-            </w:tcMar>
-            <w:vAlign w:val="center"/>
-          </w:tcPr>
-          <w:p>
-            <w:r>
-              <w:rPr>
-                <w:rFonts w:ascii="Arial" w:cs="Arial" w:eastAsia="Arial" w:hAnsi="Arial"/>
-                <w:color w:val="2E7D32"/>
-                <w:sz w:val="20"/>
-                <w:szCs w:val="20"/>
-              </w:rPr>
-              <w:t xml:space="preserve">✓</w:t>
-            </w:r>
-          </w:p>
-        </w:tc>
-        <w:tc>
-          <w:tcPr>
-            <w:tcW w:type="dxa" w:w="1200"/>
+            <w:tcW w:type="dxa" w:w="1400"/>
             <w:tcBorders>
               <w:top w:val="single" w:color="CCCCCC" w:sz="1"/>
               <w:left w:val="single" w:color="CCCCCC" w:sz="1"/>
@@ -4921,33 +4352,33 @@
         </w:tc>
         <w:tc>
           <w:tcPr>
-            <w:tcW w:type="dxa" w:w="1160"/>
-            <w:tcBorders>
-              <w:top w:val="single" w:color="CCCCCC" w:sz="1"/>
-              <w:left w:val="single" w:color="CCCCCC" w:sz="1"/>
-              <w:bottom w:val="single" w:color="CCCCCC" w:sz="1"/>
-              <w:right w:val="single" w:color="CCCCCC" w:sz="1"/>
-            </w:tcBorders>
-            <w:shd w:fill="F5F9FC" w:val="clear"/>
-            <w:tcMar>
-              <w:top w:type="dxa" w:w="80"/>
-              <w:left w:type="dxa" w:w="120"/>
-              <w:bottom w:type="dxa" w:w="80"/>
-              <w:right w:type="dxa" w:w="120"/>
-            </w:tcMar>
-            <w:vAlign w:val="center"/>
-          </w:tcPr>
-          <w:p>
-            <w:r>
-              <w:rPr>
-                <w:rFonts w:ascii="Arial" w:cs="Arial" w:eastAsia="Arial" w:hAnsi="Arial"/>
-                <w:b/>
-                <w:bCs/>
-                <w:color w:val="333333"/>
-                <w:sz w:val="20"/>
-                <w:szCs w:val="20"/>
-              </w:rPr>
-              <w:t xml:space="preserve">4</w:t>
+            <w:tcW w:type="dxa" w:w="1260"/>
+            <w:tcBorders>
+              <w:top w:val="single" w:color="CCCCCC" w:sz="1"/>
+              <w:left w:val="single" w:color="CCCCCC" w:sz="1"/>
+              <w:bottom w:val="single" w:color="CCCCCC" w:sz="1"/>
+              <w:right w:val="single" w:color="CCCCCC" w:sz="1"/>
+            </w:tcBorders>
+            <w:shd w:fill="F5F9FC" w:val="clear"/>
+            <w:tcMar>
+              <w:top w:type="dxa" w:w="80"/>
+              <w:left w:type="dxa" w:w="120"/>
+              <w:bottom w:type="dxa" w:w="80"/>
+              <w:right w:type="dxa" w:w="120"/>
+            </w:tcMar>
+            <w:vAlign w:val="center"/>
+          </w:tcPr>
+          <w:p>
+            <w:r>
+              <w:rPr>
+                <w:rFonts w:ascii="Arial" w:cs="Arial" w:eastAsia="Arial" w:hAnsi="Arial"/>
+                <w:b/>
+                <w:bCs/>
+                <w:color w:val="333333"/>
+                <w:sz w:val="20"/>
+                <w:szCs w:val="20"/>
+              </w:rPr>
+              <w:t xml:space="preserve">3</w:t>
             </w:r>
           </w:p>
         </w:tc>
@@ -4955,7 +4386,7 @@
       <w:tr>
         <w:tc>
           <w:tcPr>
-            <w:tcW w:type="dxa" w:w="2200"/>
+            <w:tcW w:type="dxa" w:w="2400"/>
             <w:tcBorders>
               <w:top w:val="single" w:color="CCCCCC" w:sz="1"/>
               <w:left w:val="single" w:color="CCCCCC" w:sz="1"/>
@@ -4986,7 +4417,7 @@
         </w:tc>
         <w:tc>
           <w:tcPr>
-            <w:tcW w:type="dxa" w:w="1200"/>
+            <w:tcW w:type="dxa" w:w="1500"/>
             <w:tcBorders>
               <w:top w:val="single" w:color="CCCCCC" w:sz="1"/>
               <w:left w:val="single" w:color="CCCCCC" w:sz="1"/>
@@ -5015,7 +4446,7 @@
         </w:tc>
         <w:tc>
           <w:tcPr>
-            <w:tcW w:type="dxa" w:w="1200"/>
+            <w:tcW w:type="dxa" w:w="1400"/>
             <w:tcBorders>
               <w:top w:val="single" w:color="CCCCCC" w:sz="1"/>
               <w:left w:val="single" w:color="CCCCCC" w:sz="1"/>
@@ -5044,7 +4475,7 @@
         </w:tc>
         <w:tc>
           <w:tcPr>
-            <w:tcW w:type="dxa" w:w="1200"/>
+            <w:tcW w:type="dxa" w:w="1400"/>
             <w:tcBorders>
               <w:top w:val="single" w:color="CCCCCC" w:sz="1"/>
               <w:left w:val="single" w:color="CCCCCC" w:sz="1"/>
@@ -5073,7 +4504,7 @@
         </w:tc>
         <w:tc>
           <w:tcPr>
-            <w:tcW w:type="dxa" w:w="1200"/>
+            <w:tcW w:type="dxa" w:w="1400"/>
             <w:tcBorders>
               <w:top w:val="single" w:color="CCCCCC" w:sz="1"/>
               <w:left w:val="single" w:color="CCCCCC" w:sz="1"/>
@@ -5102,36 +4533,7 @@
         </w:tc>
         <w:tc>
           <w:tcPr>
-            <w:tcW w:type="dxa" w:w="1200"/>
-            <w:tcBorders>
-              <w:top w:val="single" w:color="CCCCCC" w:sz="1"/>
-              <w:left w:val="single" w:color="CCCCCC" w:sz="1"/>
-              <w:bottom w:val="single" w:color="CCCCCC" w:sz="1"/>
-              <w:right w:val="single" w:color="CCCCCC" w:sz="1"/>
-            </w:tcBorders>
-            <w:tcMar>
-              <w:top w:type="dxa" w:w="80"/>
-              <w:left w:type="dxa" w:w="120"/>
-              <w:bottom w:type="dxa" w:w="80"/>
-              <w:right w:type="dxa" w:w="120"/>
-            </w:tcMar>
-            <w:vAlign w:val="center"/>
-          </w:tcPr>
-          <w:p>
-            <w:r>
-              <w:rPr>
-                <w:rFonts w:ascii="Arial" w:cs="Arial" w:eastAsia="Arial" w:hAnsi="Arial"/>
-                <w:color w:val="BDBDBD"/>
-                <w:sz w:val="20"/>
-                <w:szCs w:val="20"/>
-              </w:rPr>
-              <w:t xml:space="preserve">–</w:t>
-            </w:r>
-          </w:p>
-        </w:tc>
-        <w:tc>
-          <w:tcPr>
-            <w:tcW w:type="dxa" w:w="1160"/>
+            <w:tcW w:type="dxa" w:w="1260"/>
             <w:tcBorders>
               <w:top w:val="single" w:color="CCCCCC" w:sz="1"/>
               <w:left w:val="single" w:color="CCCCCC" w:sz="1"/>
@@ -5164,7 +4566,7 @@
       <w:tr>
         <w:tc>
           <w:tcPr>
-            <w:tcW w:type="dxa" w:w="2200"/>
+            <w:tcW w:type="dxa" w:w="2400"/>
             <w:tcBorders>
               <w:top w:val="single" w:color="CCCCCC" w:sz="1"/>
               <w:left w:val="single" w:color="CCCCCC" w:sz="1"/>
@@ -5196,7 +4598,7 @@
         </w:tc>
         <w:tc>
           <w:tcPr>
-            <w:tcW w:type="dxa" w:w="1200"/>
+            <w:tcW w:type="dxa" w:w="1500"/>
             <w:tcBorders>
               <w:top w:val="single" w:color="CCCCCC" w:sz="1"/>
               <w:left w:val="single" w:color="CCCCCC" w:sz="1"/>
@@ -5226,7 +4628,7 @@
         </w:tc>
         <w:tc>
           <w:tcPr>
-            <w:tcW w:type="dxa" w:w="1200"/>
+            <w:tcW w:type="dxa" w:w="1400"/>
             <w:tcBorders>
               <w:top w:val="single" w:color="CCCCCC" w:sz="1"/>
               <w:left w:val="single" w:color="CCCCCC" w:sz="1"/>
@@ -5256,7 +4658,7 @@
         </w:tc>
         <w:tc>
           <w:tcPr>
-            <w:tcW w:type="dxa" w:w="1200"/>
+            <w:tcW w:type="dxa" w:w="1400"/>
             <w:tcBorders>
               <w:top w:val="single" w:color="CCCCCC" w:sz="1"/>
               <w:left w:val="single" w:color="CCCCCC" w:sz="1"/>
@@ -5286,37 +4688,7 @@
         </w:tc>
         <w:tc>
           <w:tcPr>
-            <w:tcW w:type="dxa" w:w="1200"/>
-            <w:tcBorders>
-              <w:top w:val="single" w:color="CCCCCC" w:sz="1"/>
-              <w:left w:val="single" w:color="CCCCCC" w:sz="1"/>
-              <w:bottom w:val="single" w:color="CCCCCC" w:sz="1"/>
-              <w:right w:val="single" w:color="CCCCCC" w:sz="1"/>
-            </w:tcBorders>
-            <w:shd w:fill="F5F9FC" w:val="clear"/>
-            <w:tcMar>
-              <w:top w:type="dxa" w:w="80"/>
-              <w:left w:type="dxa" w:w="120"/>
-              <w:bottom w:type="dxa" w:w="80"/>
-              <w:right w:type="dxa" w:w="120"/>
-            </w:tcMar>
-            <w:vAlign w:val="center"/>
-          </w:tcPr>
-          <w:p>
-            <w:r>
-              <w:rPr>
-                <w:rFonts w:ascii="Arial" w:cs="Arial" w:eastAsia="Arial" w:hAnsi="Arial"/>
-                <w:color w:val="2E7D32"/>
-                <w:sz w:val="20"/>
-                <w:szCs w:val="20"/>
-              </w:rPr>
-              <w:t xml:space="preserve">✓</w:t>
-            </w:r>
-          </w:p>
-        </w:tc>
-        <w:tc>
-          <w:tcPr>
-            <w:tcW w:type="dxa" w:w="1200"/>
+            <w:tcW w:type="dxa" w:w="1400"/>
             <w:tcBorders>
               <w:top w:val="single" w:color="CCCCCC" w:sz="1"/>
               <w:left w:val="single" w:color="CCCCCC" w:sz="1"/>
@@ -5346,33 +4718,33 @@
         </w:tc>
         <w:tc>
           <w:tcPr>
-            <w:tcW w:type="dxa" w:w="1160"/>
-            <w:tcBorders>
-              <w:top w:val="single" w:color="CCCCCC" w:sz="1"/>
-              <w:left w:val="single" w:color="CCCCCC" w:sz="1"/>
-              <w:bottom w:val="single" w:color="CCCCCC" w:sz="1"/>
-              <w:right w:val="single" w:color="CCCCCC" w:sz="1"/>
-            </w:tcBorders>
-            <w:shd w:fill="F5F9FC" w:val="clear"/>
-            <w:tcMar>
-              <w:top w:type="dxa" w:w="80"/>
-              <w:left w:type="dxa" w:w="120"/>
-              <w:bottom w:type="dxa" w:w="80"/>
-              <w:right w:type="dxa" w:w="120"/>
-            </w:tcMar>
-            <w:vAlign w:val="center"/>
-          </w:tcPr>
-          <w:p>
-            <w:r>
-              <w:rPr>
-                <w:rFonts w:ascii="Arial" w:cs="Arial" w:eastAsia="Arial" w:hAnsi="Arial"/>
-                <w:b/>
-                <w:bCs/>
-                <w:color w:val="333333"/>
-                <w:sz w:val="20"/>
-                <w:szCs w:val="20"/>
-              </w:rPr>
-              <w:t xml:space="preserve">4</w:t>
+            <w:tcW w:type="dxa" w:w="1260"/>
+            <w:tcBorders>
+              <w:top w:val="single" w:color="CCCCCC" w:sz="1"/>
+              <w:left w:val="single" w:color="CCCCCC" w:sz="1"/>
+              <w:bottom w:val="single" w:color="CCCCCC" w:sz="1"/>
+              <w:right w:val="single" w:color="CCCCCC" w:sz="1"/>
+            </w:tcBorders>
+            <w:shd w:fill="F5F9FC" w:val="clear"/>
+            <w:tcMar>
+              <w:top w:type="dxa" w:w="80"/>
+              <w:left w:type="dxa" w:w="120"/>
+              <w:bottom w:type="dxa" w:w="80"/>
+              <w:right w:type="dxa" w:w="120"/>
+            </w:tcMar>
+            <w:vAlign w:val="center"/>
+          </w:tcPr>
+          <w:p>
+            <w:r>
+              <w:rPr>
+                <w:rFonts w:ascii="Arial" w:cs="Arial" w:eastAsia="Arial" w:hAnsi="Arial"/>
+                <w:b/>
+                <w:bCs/>
+                <w:color w:val="333333"/>
+                <w:sz w:val="20"/>
+                <w:szCs w:val="20"/>
+              </w:rPr>
+              <w:t xml:space="preserve">3</w:t>
             </w:r>
           </w:p>
         </w:tc>
@@ -5380,7 +4752,7 @@
       <w:tr>
         <w:tc>
           <w:tcPr>
-            <w:tcW w:type="dxa" w:w="2200"/>
+            <w:tcW w:type="dxa" w:w="2400"/>
             <w:tcBorders>
               <w:top w:val="single" w:color="CCCCCC" w:sz="1"/>
               <w:left w:val="single" w:color="CCCCCC" w:sz="1"/>
@@ -5411,7 +4783,7 @@
         </w:tc>
         <w:tc>
           <w:tcPr>
-            <w:tcW w:type="dxa" w:w="1200"/>
+            <w:tcW w:type="dxa" w:w="1500"/>
             <w:tcBorders>
               <w:top w:val="single" w:color="CCCCCC" w:sz="1"/>
               <w:left w:val="single" w:color="CCCCCC" w:sz="1"/>
@@ -5440,7 +4812,7 @@
         </w:tc>
         <w:tc>
           <w:tcPr>
-            <w:tcW w:type="dxa" w:w="1200"/>
+            <w:tcW w:type="dxa" w:w="1400"/>
             <w:tcBorders>
               <w:top w:val="single" w:color="CCCCCC" w:sz="1"/>
               <w:left w:val="single" w:color="CCCCCC" w:sz="1"/>
@@ -5469,36 +4841,7 @@
         </w:tc>
         <w:tc>
           <w:tcPr>
-            <w:tcW w:type="dxa" w:w="1200"/>
-            <w:tcBorders>
-              <w:top w:val="single" w:color="CCCCCC" w:sz="1"/>
-              <w:left w:val="single" w:color="CCCCCC" w:sz="1"/>
-              <w:bottom w:val="single" w:color="CCCCCC" w:sz="1"/>
-              <w:right w:val="single" w:color="CCCCCC" w:sz="1"/>
-            </w:tcBorders>
-            <w:tcMar>
-              <w:top w:type="dxa" w:w="80"/>
-              <w:left w:type="dxa" w:w="120"/>
-              <w:bottom w:type="dxa" w:w="80"/>
-              <w:right w:type="dxa" w:w="120"/>
-            </w:tcMar>
-            <w:vAlign w:val="center"/>
-          </w:tcPr>
-          <w:p>
-            <w:r>
-              <w:rPr>
-                <w:rFonts w:ascii="Arial" w:cs="Arial" w:eastAsia="Arial" w:hAnsi="Arial"/>
-                <w:color w:val="BDBDBD"/>
-                <w:sz w:val="20"/>
-                <w:szCs w:val="20"/>
-              </w:rPr>
-              <w:t xml:space="preserve">–</w:t>
-            </w:r>
-          </w:p>
-        </w:tc>
-        <w:tc>
-          <w:tcPr>
-            <w:tcW w:type="dxa" w:w="1200"/>
+            <w:tcW w:type="dxa" w:w="1400"/>
             <w:tcBorders>
               <w:top w:val="single" w:color="CCCCCC" w:sz="1"/>
               <w:left w:val="single" w:color="CCCCCC" w:sz="1"/>
@@ -5527,7 +4870,7 @@
         </w:tc>
         <w:tc>
           <w:tcPr>
-            <w:tcW w:type="dxa" w:w="1200"/>
+            <w:tcW w:type="dxa" w:w="1400"/>
             <w:tcBorders>
               <w:top w:val="single" w:color="CCCCCC" w:sz="1"/>
               <w:left w:val="single" w:color="CCCCCC" w:sz="1"/>
@@ -5556,7 +4899,7 @@
         </w:tc>
         <w:tc>
           <w:tcPr>
-            <w:tcW w:type="dxa" w:w="1160"/>
+            <w:tcW w:type="dxa" w:w="1260"/>
             <w:tcBorders>
               <w:top w:val="single" w:color="CCCCCC" w:sz="1"/>
               <w:left w:val="single" w:color="CCCCCC" w:sz="1"/>
@@ -5602,7 +4945,7 @@
           <w:sz w:val="22"/>
           <w:szCs w:val="22"/>
         </w:rPr>
-        <w:t xml:space="preserve">11 of 15 tenants have 4+ signals. Two tenants (Innovist, Traya Health) show only 2 signals due to missing inventory data in the DWH snapshot. S7 (Regional Concentration) fires for only 2 tenants because most SKUs have distributed order patterns rather than single-state concentration.</w:t>
+        <w:t xml:space="preserve">13 of 15 tenants have 3+ signals. Two tenants (Innovist, Traya Health) have fewer signals due to missing inventory data in the DWH snapshot. S7 (Regional Concentration) fires for only 3 tenants because most SKUs have distributed order patterns rather than single-state concentration.</w:t>
       </w:r>
     </w:p>
     <w:p>
@@ -6098,7 +5441,7 @@
                 <w:sz w:val="20"/>
                 <w:szCs w:val="20"/>
               </w:rPr>
-              <w:t xml:space="preserve">Overlap: a channel can appear in both Listing Gap and Channel Expansion. The 50% coverage threshold is hardcoded with no segment adjustment.</w:t>
+              <w:t xml:space="preserve">Fixed in PoC: merged into single Listing Coverage signal. Remaining gap: 50% coverage threshold is hardcoded with no segment adjustment.</w:t>
             </w:r>
           </w:p>
         </w:tc>
@@ -6128,7 +5471,7 @@
                 <w:sz w:val="20"/>
                 <w:szCs w:val="20"/>
               </w:rPr>
-              <w:t xml:space="preserve">Sellers may see two signals pointing at the same problem. Threshold may be too aggressive for fashion (many SKUs) and too lenient for supplements (few SKUs).</w:t>
+              <w:t xml:space="preserve">Threshold may be too aggressive for fashion (many SKUs) and too lenient for supplements (few SKUs).</w:t>
             </w:r>
           </w:p>
         </w:tc>
@@ -6222,7 +5565,7 @@
                 <w:sz w:val="20"/>
                 <w:szCs w:val="20"/>
               </w:rPr>
-              <w:t xml:space="preserve">Revenue uses 90-day avg selling price but DOH uses 30-day sales velocity. Bestseller threshold (5 units/month) is absolute, not relative to AOV.</w:t>
+              <w:t xml:space="preserve">Fixed in PoC: bestseller changed from absolute (5+ units/month) to top 20% by sales volume per tenant. Remaining gap: revenue uses 90-day avg price but DOH uses 30-day velocity.</w:t>
             </w:r>
           </w:p>
         </w:tc>
@@ -6251,7 +5594,7 @@
                 <w:sz w:val="20"/>
                 <w:szCs w:val="20"/>
               </w:rPr>
-              <w:t xml:space="preserve">Seasonal SKUs may show inflated or deflated revenue. A high-AOV SKU selling 3/month still matters.</w:t>
+              <w:t xml:space="preserve">Seasonal SKUs may show inflated or deflated revenue at risk. Time window mismatch between price and velocity.</w:t>
             </w:r>
           </w:p>
         </w:tc>
@@ -6282,7 +5625,7 @@
                 <w:sz w:val="20"/>
                 <w:szCs w:val="20"/>
               </w:rPr>
-              <w:t xml:space="preserve">Medium</w:t>
+              <w:t xml:space="preserve">Low</w:t>
             </w:r>
           </w:p>
         </w:tc>

</xml_diff>